<commit_message>
Finished setup with mock data
</commit_message>
<xml_diff>
--- a/docs/RoadMap.docx
+++ b/docs/RoadMap.docx
@@ -9081,487 +9081,2951 @@
           <w:lang w:val="en-US"/>
         </w:rPr>
       </w:pPr>
+    </w:p>
+    <w:p>
+      <w:pPr>
+        <w:rPr>
+          <w:rFonts w:hint="default" w:ascii="SimSun" w:hAnsi="SimSun" w:eastAsia="SimSun" w:cs="SimSun"/>
+          <w:sz w:val="24"/>
+          <w:szCs w:val="24"/>
+          <w:lang w:val="en-US"/>
+        </w:rPr>
+      </w:pPr>
+    </w:p>
+    <w:p>
+      <w:pPr>
+        <w:rPr>
+          <w:rFonts w:hint="default" w:ascii="SimSun" w:hAnsi="SimSun" w:eastAsia="SimSun" w:cs="SimSun"/>
+          <w:sz w:val="24"/>
+          <w:szCs w:val="24"/>
+          <w:lang w:val="en-US"/>
+        </w:rPr>
+      </w:pPr>
+      <w:r>
+        <w:rPr>
+          <w:rFonts w:hint="default" w:ascii="SimSun" w:hAnsi="SimSun" w:eastAsia="SimSun" w:cs="SimSun"/>
+          <w:sz w:val="24"/>
+          <w:szCs w:val="24"/>
+          <w:lang w:val="en-US"/>
+        </w:rPr>
+        <w:t>Final Backend Arch:</w:t>
+      </w:r>
+    </w:p>
+    <w:p>
+      <w:pPr>
+        <w:rPr>
+          <w:rFonts w:hint="default" w:ascii="SimSun" w:hAnsi="SimSun" w:eastAsia="SimSun" w:cs="SimSun"/>
+          <w:sz w:val="24"/>
+          <w:szCs w:val="24"/>
+          <w:lang w:val="en-US"/>
+        </w:rPr>
+      </w:pPr>
+    </w:p>
+    <w:p>
+      <w:pPr>
+        <w:jc w:val="center"/>
+        <w:rPr>
+          <w:rFonts w:hint="default" w:ascii="SimSun" w:hAnsi="SimSun" w:eastAsia="SimSun" w:cs="SimSun"/>
+          <w:sz w:val="24"/>
+          <w:szCs w:val="24"/>
+          <w:lang w:val="en-US"/>
+        </w:rPr>
+      </w:pPr>
+      <w:r>
+        <w:rPr>
+          <w:rFonts w:hint="default" w:ascii="SimSun" w:hAnsi="SimSun" w:eastAsia="SimSun" w:cs="SimSun"/>
+          <w:sz w:val="24"/>
+          <w:szCs w:val="24"/>
+          <w:lang w:val="en-US"/>
+        </w:rPr>
+        <w:t>Next.js Frontend</w:t>
+      </w:r>
+    </w:p>
+    <w:p>
+      <w:pPr>
+        <w:jc w:val="center"/>
+        <w:rPr>
+          <w:rFonts w:hint="default" w:ascii="SimSun" w:hAnsi="SimSun" w:eastAsia="SimSun" w:cs="SimSun"/>
+          <w:sz w:val="24"/>
+          <w:szCs w:val="24"/>
+          <w:lang w:val="en-US"/>
+        </w:rPr>
+      </w:pPr>
+      <w:r>
+        <w:rPr>
+          <w:rFonts w:hint="default" w:ascii="SimSun" w:hAnsi="SimSun" w:eastAsia="SimSun" w:cs="SimSun"/>
+          <w:sz w:val="24"/>
+          <w:szCs w:val="24"/>
+          <w:lang w:val="en-US"/>
+        </w:rPr>
+        <w:t>│</w:t>
+      </w:r>
+    </w:p>
+    <w:p>
+      <w:pPr>
+        <w:jc w:val="center"/>
+        <w:rPr>
+          <w:rFonts w:hint="default" w:ascii="SimSun" w:hAnsi="SimSun" w:eastAsia="SimSun" w:cs="SimSun"/>
+          <w:sz w:val="24"/>
+          <w:szCs w:val="24"/>
+          <w:lang w:val="en-US"/>
+        </w:rPr>
+      </w:pPr>
+      <w:r>
+        <w:rPr>
+          <w:rFonts w:hint="default" w:ascii="SimSun" w:hAnsi="SimSun" w:eastAsia="SimSun" w:cs="SimSun"/>
+          <w:sz w:val="24"/>
+          <w:szCs w:val="24"/>
+          <w:lang w:val="en-US"/>
+        </w:rPr>
+        <w:t>HTTP Requests</w:t>
+      </w:r>
+    </w:p>
+    <w:p>
+      <w:pPr>
+        <w:jc w:val="center"/>
+        <w:rPr>
+          <w:rFonts w:hint="default" w:ascii="SimSun" w:hAnsi="SimSun" w:eastAsia="SimSun" w:cs="SimSun"/>
+          <w:sz w:val="24"/>
+          <w:szCs w:val="24"/>
+          <w:lang w:val="en-US"/>
+        </w:rPr>
+      </w:pPr>
+      <w:r>
+        <w:rPr>
+          <w:rFonts w:hint="default" w:ascii="SimSun" w:hAnsi="SimSun" w:eastAsia="SimSun" w:cs="SimSun"/>
+          <w:sz w:val="24"/>
+          <w:szCs w:val="24"/>
+          <w:lang w:val="en-US"/>
+        </w:rPr>
+        <w:t>│</w:t>
+      </w:r>
+    </w:p>
+    <w:p>
+      <w:pPr>
+        <w:jc w:val="center"/>
+        <w:rPr>
+          <w:rFonts w:hint="default" w:ascii="SimSun" w:hAnsi="SimSun" w:eastAsia="SimSun" w:cs="SimSun"/>
+          <w:sz w:val="24"/>
+          <w:szCs w:val="24"/>
+          <w:lang w:val="en-US"/>
+        </w:rPr>
+      </w:pPr>
+      <w:r>
+        <w:rPr>
+          <w:rFonts w:hint="default" w:ascii="SimSun" w:hAnsi="SimSun" w:eastAsia="SimSun" w:cs="SimSun"/>
+          <w:sz w:val="24"/>
+          <w:szCs w:val="24"/>
+          <w:lang w:val="en-US"/>
+        </w:rPr>
+        <w:t>FastAPI Routes</w:t>
+      </w:r>
+    </w:p>
+    <w:p>
+      <w:pPr>
+        <w:jc w:val="center"/>
+        <w:rPr>
+          <w:rFonts w:hint="default" w:ascii="SimSun" w:hAnsi="SimSun" w:eastAsia="SimSun" w:cs="SimSun"/>
+          <w:sz w:val="24"/>
+          <w:szCs w:val="24"/>
+          <w:lang w:val="en-US"/>
+        </w:rPr>
+      </w:pPr>
+      <w:r>
+        <w:rPr>
+          <w:rFonts w:hint="default" w:ascii="SimSun" w:hAnsi="SimSun" w:eastAsia="SimSun" w:cs="SimSun"/>
+          <w:sz w:val="24"/>
+          <w:szCs w:val="24"/>
+          <w:lang w:val="en-US"/>
+        </w:rPr>
+        <w:t>│</w:t>
+      </w:r>
+    </w:p>
+    <w:p>
+      <w:pPr>
+        <w:jc w:val="center"/>
+        <w:rPr>
+          <w:rFonts w:hint="default" w:ascii="SimSun" w:hAnsi="SimSun" w:eastAsia="SimSun" w:cs="SimSun"/>
+          <w:sz w:val="24"/>
+          <w:szCs w:val="24"/>
+          <w:lang w:val="en-US"/>
+        </w:rPr>
+      </w:pPr>
+      <w:r>
+        <w:rPr>
+          <w:rFonts w:hint="default" w:ascii="SimSun" w:hAnsi="SimSun" w:eastAsia="SimSun" w:cs="SimSun"/>
+          <w:sz w:val="24"/>
+          <w:szCs w:val="24"/>
+          <w:lang w:val="en-US"/>
+        </w:rPr>
+        <w:t>┌───────────────┼────────────────┐</w:t>
+      </w:r>
+    </w:p>
+    <w:p>
+      <w:pPr>
+        <w:jc w:val="center"/>
+        <w:rPr>
+          <w:rFonts w:hint="default" w:ascii="SimSun" w:hAnsi="SimSun" w:eastAsia="SimSun" w:cs="SimSun"/>
+          <w:sz w:val="24"/>
+          <w:szCs w:val="24"/>
+          <w:lang w:val="en-US"/>
+        </w:rPr>
+      </w:pPr>
+      <w:r>
+        <w:rPr>
+          <w:rFonts w:hint="default" w:ascii="SimSun" w:hAnsi="SimSun" w:eastAsia="SimSun" w:cs="SimSun"/>
+          <w:sz w:val="24"/>
+          <w:szCs w:val="24"/>
+          <w:lang w:val="en-US"/>
+        </w:rPr>
+        <w:t>▼               ▼               ▼</w:t>
+      </w:r>
+    </w:p>
+    <w:p>
+      <w:pPr>
+        <w:jc w:val="center"/>
+        <w:rPr>
+          <w:rFonts w:hint="default" w:ascii="SimSun" w:hAnsi="SimSun" w:eastAsia="SimSun" w:cs="SimSun"/>
+          <w:sz w:val="24"/>
+          <w:szCs w:val="24"/>
+          <w:lang w:val="en-US"/>
+        </w:rPr>
+      </w:pPr>
+      <w:r>
+        <w:rPr>
+          <w:rFonts w:hint="default" w:ascii="SimSun" w:hAnsi="SimSun" w:eastAsia="SimSun" w:cs="SimSun"/>
+          <w:sz w:val="24"/>
+          <w:szCs w:val="24"/>
+          <w:lang w:val="en-US"/>
+        </w:rPr>
+        <w:t>ForecastService  AttributionService  SimulationService</w:t>
+      </w:r>
+    </w:p>
+    <w:p>
+      <w:pPr>
+        <w:jc w:val="center"/>
+        <w:rPr>
+          <w:rFonts w:hint="default" w:ascii="SimSun" w:hAnsi="SimSun" w:eastAsia="SimSun" w:cs="SimSun"/>
+          <w:sz w:val="24"/>
+          <w:szCs w:val="24"/>
+          <w:lang w:val="en-US"/>
+        </w:rPr>
+      </w:pPr>
+      <w:r>
+        <w:rPr>
+          <w:rFonts w:hint="default" w:ascii="SimSun" w:hAnsi="SimSun" w:eastAsia="SimSun" w:cs="SimSun"/>
+          <w:sz w:val="24"/>
+          <w:szCs w:val="24"/>
+          <w:lang w:val="en-US"/>
+        </w:rPr>
+        <w:t>│               │               │</w:t>
+      </w:r>
+    </w:p>
+    <w:p>
+      <w:pPr>
+        <w:jc w:val="center"/>
+        <w:rPr>
+          <w:rFonts w:hint="default" w:ascii="SimSun" w:hAnsi="SimSun" w:eastAsia="SimSun" w:cs="SimSun"/>
+          <w:sz w:val="24"/>
+          <w:szCs w:val="24"/>
+          <w:lang w:val="en-US"/>
+        </w:rPr>
+      </w:pPr>
+      <w:r>
+        <w:rPr>
+          <w:rFonts w:hint="default" w:ascii="SimSun" w:hAnsi="SimSun" w:eastAsia="SimSun" w:cs="SimSun"/>
+          <w:sz w:val="24"/>
+          <w:szCs w:val="24"/>
+          <w:lang w:val="en-US"/>
+        </w:rPr>
+        <w:t>└───────────────┼───────────────┘</w:t>
+      </w:r>
+    </w:p>
+    <w:p>
+      <w:pPr>
+        <w:jc w:val="center"/>
+        <w:rPr>
+          <w:rFonts w:hint="default" w:ascii="SimSun" w:hAnsi="SimSun" w:eastAsia="SimSun" w:cs="SimSun"/>
+          <w:sz w:val="24"/>
+          <w:szCs w:val="24"/>
+          <w:lang w:val="en-US"/>
+        </w:rPr>
+      </w:pPr>
+      <w:r>
+        <w:rPr>
+          <w:rFonts w:hint="default" w:ascii="SimSun" w:hAnsi="SimSun" w:eastAsia="SimSun" w:cs="SimSun"/>
+          <w:sz w:val="24"/>
+          <w:szCs w:val="24"/>
+          <w:lang w:val="en-US"/>
+        </w:rPr>
+        <w:t>▼</w:t>
+      </w:r>
+    </w:p>
+    <w:p>
+      <w:pPr>
+        <w:jc w:val="center"/>
+        <w:rPr>
+          <w:rFonts w:hint="default" w:ascii="SimSun" w:hAnsi="SimSun" w:eastAsia="SimSun" w:cs="SimSun"/>
+          <w:sz w:val="24"/>
+          <w:szCs w:val="24"/>
+          <w:lang w:val="en-US"/>
+        </w:rPr>
+      </w:pPr>
+      <w:r>
+        <w:rPr>
+          <w:rFonts w:hint="default" w:ascii="SimSun" w:hAnsi="SimSun" w:eastAsia="SimSun" w:cs="SimSun"/>
+          <w:sz w:val="24"/>
+          <w:szCs w:val="24"/>
+          <w:lang w:val="en-US"/>
+        </w:rPr>
+        <w:t>AdvisoryService</w:t>
+      </w:r>
+    </w:p>
+    <w:p>
+      <w:pPr>
+        <w:jc w:val="center"/>
+        <w:rPr>
+          <w:rFonts w:hint="default" w:ascii="SimSun" w:hAnsi="SimSun" w:eastAsia="SimSun" w:cs="SimSun"/>
+          <w:sz w:val="24"/>
+          <w:szCs w:val="24"/>
+          <w:lang w:val="en-US"/>
+        </w:rPr>
+      </w:pPr>
+      <w:r>
+        <w:rPr>
+          <w:rFonts w:hint="default" w:ascii="SimSun" w:hAnsi="SimSun" w:eastAsia="SimSun" w:cs="SimSun"/>
+          <w:sz w:val="24"/>
+          <w:szCs w:val="24"/>
+          <w:lang w:val="en-US"/>
+        </w:rPr>
+        <w:t>│</w:t>
+      </w:r>
+    </w:p>
+    <w:p>
+      <w:pPr>
+        <w:jc w:val="center"/>
+        <w:rPr>
+          <w:rFonts w:hint="default" w:ascii="SimSun" w:hAnsi="SimSun" w:eastAsia="SimSun" w:cs="SimSun"/>
+          <w:sz w:val="24"/>
+          <w:szCs w:val="24"/>
+          <w:lang w:val="en-US"/>
+        </w:rPr>
+      </w:pPr>
+      <w:r>
+        <w:rPr>
+          <w:rFonts w:hint="default" w:ascii="SimSun" w:hAnsi="SimSun" w:eastAsia="SimSun" w:cs="SimSun"/>
+          <w:sz w:val="24"/>
+          <w:szCs w:val="24"/>
+          <w:lang w:val="en-US"/>
+        </w:rPr>
+        <w:t>▼</w:t>
+      </w:r>
+    </w:p>
+    <w:p>
+      <w:pPr>
+        <w:jc w:val="center"/>
+        <w:rPr>
+          <w:rFonts w:hint="default" w:ascii="SimSun" w:hAnsi="SimSun" w:eastAsia="SimSun" w:cs="SimSun"/>
+          <w:sz w:val="24"/>
+          <w:szCs w:val="24"/>
+          <w:lang w:val="en-US"/>
+        </w:rPr>
+      </w:pPr>
+      <w:r>
+        <w:rPr>
+          <w:rFonts w:hint="default" w:ascii="SimSun" w:hAnsi="SimSun" w:eastAsia="SimSun" w:cs="SimSun"/>
+          <w:sz w:val="24"/>
+          <w:szCs w:val="24"/>
+          <w:lang w:val="en-US"/>
+        </w:rPr>
+        <w:t>FeaturePreprocessor</w:t>
+      </w:r>
+    </w:p>
+    <w:p>
+      <w:pPr>
+        <w:jc w:val="center"/>
+        <w:rPr>
+          <w:rFonts w:hint="default" w:ascii="SimSun" w:hAnsi="SimSun" w:eastAsia="SimSun" w:cs="SimSun"/>
+          <w:sz w:val="24"/>
+          <w:szCs w:val="24"/>
+          <w:lang w:val="en-US"/>
+        </w:rPr>
+      </w:pPr>
+      <w:r>
+        <w:rPr>
+          <w:rFonts w:hint="default" w:ascii="SimSun" w:hAnsi="SimSun" w:eastAsia="SimSun" w:cs="SimSun"/>
+          <w:sz w:val="24"/>
+          <w:szCs w:val="24"/>
+          <w:lang w:val="en-US"/>
+        </w:rPr>
+        <w:t>│</w:t>
+      </w:r>
+    </w:p>
+    <w:p>
+      <w:pPr>
+        <w:jc w:val="center"/>
+        <w:rPr>
+          <w:rFonts w:hint="default" w:ascii="SimSun" w:hAnsi="SimSun" w:eastAsia="SimSun" w:cs="SimSun"/>
+          <w:sz w:val="24"/>
+          <w:szCs w:val="24"/>
+          <w:lang w:val="en-US"/>
+        </w:rPr>
+      </w:pPr>
+      <w:r>
+        <w:rPr>
+          <w:rFonts w:hint="default" w:ascii="SimSun" w:hAnsi="SimSun" w:eastAsia="SimSun" w:cs="SimSun"/>
+          <w:sz w:val="24"/>
+          <w:szCs w:val="24"/>
+          <w:lang w:val="en-US"/>
+        </w:rPr>
+        <w:t>▼</w:t>
+      </w:r>
+    </w:p>
+    <w:p>
+      <w:pPr>
+        <w:jc w:val="center"/>
+        <w:rPr>
+          <w:rFonts w:hint="default" w:ascii="SimSun" w:hAnsi="SimSun" w:eastAsia="SimSun" w:cs="SimSun"/>
+          <w:sz w:val="24"/>
+          <w:szCs w:val="24"/>
+          <w:lang w:val="en-US"/>
+        </w:rPr>
+      </w:pPr>
+      <w:r>
+        <w:rPr>
+          <w:rFonts w:hint="default" w:ascii="SimSun" w:hAnsi="SimSun" w:eastAsia="SimSun" w:cs="SimSun"/>
+          <w:sz w:val="24"/>
+          <w:szCs w:val="24"/>
+          <w:lang w:val="en-US"/>
+        </w:rPr>
+        <w:t>ModelLoader</w:t>
+      </w:r>
+    </w:p>
+    <w:p>
+      <w:pPr>
+        <w:jc w:val="center"/>
+        <w:rPr>
+          <w:rFonts w:hint="default" w:ascii="SimSun" w:hAnsi="SimSun" w:eastAsia="SimSun" w:cs="SimSun"/>
+          <w:sz w:val="24"/>
+          <w:szCs w:val="24"/>
+          <w:lang w:val="en-US"/>
+        </w:rPr>
+      </w:pPr>
+      <w:r>
+        <w:rPr>
+          <w:rFonts w:hint="default" w:ascii="SimSun" w:hAnsi="SimSun" w:eastAsia="SimSun" w:cs="SimSun"/>
+          <w:sz w:val="24"/>
+          <w:szCs w:val="24"/>
+          <w:lang w:val="en-US"/>
+        </w:rPr>
+        <w:t>┌───────────┴───────────┐</w:t>
+      </w:r>
+    </w:p>
+    <w:p>
+      <w:pPr>
+        <w:jc w:val="center"/>
+        <w:rPr>
+          <w:rFonts w:hint="default" w:ascii="SimSun" w:hAnsi="SimSun" w:eastAsia="SimSun" w:cs="SimSun"/>
+          <w:sz w:val="24"/>
+          <w:szCs w:val="24"/>
+          <w:lang w:val="en-US"/>
+        </w:rPr>
+      </w:pPr>
+      <w:r>
+        <w:rPr>
+          <w:rFonts w:hint="default" w:ascii="SimSun" w:hAnsi="SimSun" w:eastAsia="SimSun" w:cs="SimSun"/>
+          <w:sz w:val="24"/>
+          <w:szCs w:val="24"/>
+          <w:lang w:val="en-US"/>
+        </w:rPr>
+        <w:t>▼                       ▼</w:t>
+      </w:r>
+    </w:p>
+    <w:p>
+      <w:pPr>
+        <w:jc w:val="center"/>
+        <w:rPr>
+          <w:rFonts w:hint="default" w:ascii="SimSun" w:hAnsi="SimSun" w:eastAsia="SimSun" w:cs="SimSun"/>
+          <w:sz w:val="24"/>
+          <w:szCs w:val="24"/>
+          <w:lang w:val="en-US"/>
+        </w:rPr>
+      </w:pPr>
+      <w:r>
+        <w:rPr>
+          <w:rFonts w:hint="default" w:ascii="SimSun" w:hAnsi="SimSun" w:eastAsia="SimSun" w:cs="SimSun"/>
+          <w:sz w:val="24"/>
+          <w:szCs w:val="24"/>
+          <w:lang w:val="en-US"/>
+        </w:rPr>
+        <w:t>XGBoost Models          SHAP Artifacts</w:t>
+      </w:r>
+    </w:p>
+    <w:p>
+      <w:pPr>
+        <w:jc w:val="center"/>
+        <w:rPr>
+          <w:rFonts w:hint="default" w:ascii="SimSun" w:hAnsi="SimSun" w:eastAsia="SimSun" w:cs="SimSun"/>
+          <w:sz w:val="24"/>
+          <w:szCs w:val="24"/>
+          <w:lang w:val="en-US"/>
+        </w:rPr>
+      </w:pPr>
+    </w:p>
+    <w:p>
+      <w:pPr>
+        <w:jc w:val="center"/>
+        <w:rPr>
+          <w:rFonts w:hint="default" w:ascii="SimSun" w:hAnsi="SimSun" w:eastAsia="SimSun" w:cs="SimSun"/>
+          <w:sz w:val="24"/>
+          <w:szCs w:val="24"/>
+          <w:lang w:val="en-US"/>
+        </w:rPr>
+      </w:pPr>
+    </w:p>
+    <w:p>
+      <w:pPr>
+        <w:jc w:val="center"/>
+        <w:rPr>
+          <w:rFonts w:hint="default" w:ascii="SimSun" w:hAnsi="SimSun" w:eastAsia="SimSun" w:cs="SimSun"/>
+          <w:sz w:val="24"/>
+          <w:szCs w:val="24"/>
+          <w:lang w:val="en-US"/>
+        </w:rPr>
+      </w:pPr>
+    </w:p>
+    <w:p>
+      <w:pPr>
+        <w:jc w:val="center"/>
+        <w:rPr>
+          <w:rFonts w:hint="default" w:ascii="SimSun" w:hAnsi="SimSun" w:eastAsia="SimSun" w:cs="SimSun"/>
+          <w:sz w:val="24"/>
+          <w:szCs w:val="24"/>
+          <w:lang w:val="en-US"/>
+        </w:rPr>
+      </w:pPr>
+    </w:p>
+    <w:p>
+      <w:pPr>
+        <w:jc w:val="center"/>
+        <w:rPr>
+          <w:rFonts w:hint="default" w:ascii="SimSun" w:hAnsi="SimSun" w:eastAsia="SimSun" w:cs="SimSun"/>
+          <w:sz w:val="24"/>
+          <w:szCs w:val="24"/>
+          <w:lang w:val="en-US"/>
+        </w:rPr>
+      </w:pPr>
+    </w:p>
+    <w:p>
+      <w:pPr>
+        <w:jc w:val="center"/>
+        <w:rPr>
+          <w:rFonts w:hint="default" w:ascii="SimSun" w:hAnsi="SimSun" w:eastAsia="SimSun" w:cs="SimSun"/>
+          <w:sz w:val="24"/>
+          <w:szCs w:val="24"/>
+          <w:lang w:val="en-US"/>
+        </w:rPr>
+      </w:pPr>
+    </w:p>
+    <w:p>
+      <w:pPr>
+        <w:jc w:val="center"/>
+        <w:rPr>
+          <w:rFonts w:hint="default" w:ascii="SimSun" w:hAnsi="SimSun" w:eastAsia="SimSun" w:cs="SimSun"/>
+          <w:sz w:val="24"/>
+          <w:szCs w:val="24"/>
+          <w:lang w:val="en-US"/>
+        </w:rPr>
+      </w:pPr>
+    </w:p>
+    <w:p>
+      <w:pPr>
+        <w:jc w:val="center"/>
+        <w:rPr>
+          <w:rFonts w:hint="default" w:ascii="SimSun" w:hAnsi="SimSun" w:eastAsia="SimSun" w:cs="SimSun"/>
+          <w:sz w:val="24"/>
+          <w:szCs w:val="24"/>
+          <w:lang w:val="en-US"/>
+        </w:rPr>
+      </w:pPr>
+    </w:p>
+    <w:p>
+      <w:pPr>
+        <w:jc w:val="center"/>
+        <w:rPr>
+          <w:rFonts w:hint="default" w:ascii="SimSun" w:hAnsi="SimSun" w:eastAsia="SimSun" w:cs="SimSun"/>
+          <w:sz w:val="24"/>
+          <w:szCs w:val="24"/>
+          <w:lang w:val="en-US"/>
+        </w:rPr>
+      </w:pPr>
+    </w:p>
+    <w:p>
+      <w:pPr>
+        <w:jc w:val="center"/>
+        <w:rPr>
+          <w:rFonts w:hint="default" w:ascii="SimSun" w:hAnsi="SimSun" w:eastAsia="SimSun" w:cs="SimSun"/>
+          <w:sz w:val="24"/>
+          <w:szCs w:val="24"/>
+          <w:lang w:val="en-US"/>
+        </w:rPr>
+      </w:pPr>
+    </w:p>
+    <w:p>
+      <w:pPr>
+        <w:jc w:val="center"/>
+        <w:rPr>
+          <w:rFonts w:hint="default" w:ascii="SimSun" w:hAnsi="SimSun" w:eastAsia="SimSun" w:cs="SimSun"/>
+          <w:sz w:val="24"/>
+          <w:szCs w:val="24"/>
+          <w:lang w:val="en-US"/>
+        </w:rPr>
+      </w:pPr>
+    </w:p>
+    <w:p>
+      <w:pPr>
+        <w:jc w:val="center"/>
+        <w:rPr>
+          <w:rFonts w:hint="default" w:ascii="SimSun" w:hAnsi="SimSun" w:eastAsia="SimSun" w:cs="SimSun"/>
+          <w:sz w:val="24"/>
+          <w:szCs w:val="24"/>
+          <w:lang w:val="en-US"/>
+        </w:rPr>
+      </w:pPr>
+    </w:p>
+    <w:p>
+      <w:pPr>
+        <w:jc w:val="center"/>
+        <w:rPr>
+          <w:rFonts w:hint="default" w:ascii="SimSun" w:hAnsi="SimSun" w:eastAsia="SimSun" w:cs="SimSun"/>
+          <w:sz w:val="24"/>
+          <w:szCs w:val="24"/>
+          <w:lang w:val="en-US"/>
+        </w:rPr>
+      </w:pPr>
+    </w:p>
+    <w:p>
+      <w:pPr>
+        <w:jc w:val="center"/>
+        <w:rPr>
+          <w:rFonts w:hint="default" w:ascii="SimSun" w:hAnsi="SimSun" w:eastAsia="SimSun" w:cs="SimSun"/>
+          <w:sz w:val="24"/>
+          <w:szCs w:val="24"/>
+          <w:lang w:val="en-US"/>
+        </w:rPr>
+      </w:pPr>
+    </w:p>
+    <w:p>
+      <w:pPr>
+        <w:jc w:val="center"/>
+        <w:rPr>
+          <w:rFonts w:hint="default" w:ascii="SimSun" w:hAnsi="SimSun" w:eastAsia="SimSun" w:cs="SimSun"/>
+          <w:sz w:val="24"/>
+          <w:szCs w:val="24"/>
+          <w:lang w:val="en-US"/>
+        </w:rPr>
+      </w:pPr>
+    </w:p>
+    <w:p>
+      <w:pPr>
+        <w:jc w:val="center"/>
+        <w:rPr>
+          <w:rFonts w:hint="default" w:ascii="SimSun" w:hAnsi="SimSun" w:eastAsia="SimSun" w:cs="SimSun"/>
+          <w:sz w:val="24"/>
+          <w:szCs w:val="24"/>
+          <w:lang w:val="en-US"/>
+        </w:rPr>
+      </w:pPr>
+    </w:p>
+    <w:p>
+      <w:pPr>
+        <w:jc w:val="center"/>
+        <w:rPr>
+          <w:rFonts w:hint="default" w:ascii="SimSun" w:hAnsi="SimSun" w:eastAsia="SimSun" w:cs="SimSun"/>
+          <w:sz w:val="24"/>
+          <w:szCs w:val="24"/>
+          <w:lang w:val="en-US"/>
+        </w:rPr>
+      </w:pPr>
+    </w:p>
+    <w:p>
+      <w:pPr>
+        <w:jc w:val="center"/>
+        <w:rPr>
+          <w:rFonts w:hint="default" w:ascii="SimSun" w:hAnsi="SimSun" w:eastAsia="SimSun" w:cs="SimSun"/>
+          <w:sz w:val="24"/>
+          <w:szCs w:val="24"/>
+          <w:lang w:val="en-US"/>
+        </w:rPr>
+      </w:pPr>
+    </w:p>
+    <w:p>
+      <w:pPr>
+        <w:jc w:val="center"/>
+        <w:rPr>
+          <w:rFonts w:hint="default" w:ascii="SimSun" w:hAnsi="SimSun" w:eastAsia="SimSun" w:cs="SimSun"/>
+          <w:sz w:val="24"/>
+          <w:szCs w:val="24"/>
+          <w:lang w:val="en-US"/>
+        </w:rPr>
+      </w:pPr>
+    </w:p>
+    <w:p>
+      <w:pPr>
+        <w:jc w:val="center"/>
+        <w:rPr>
+          <w:rFonts w:hint="default" w:ascii="SimSun" w:hAnsi="SimSun" w:eastAsia="SimSun" w:cs="SimSun"/>
+          <w:sz w:val="24"/>
+          <w:szCs w:val="24"/>
+          <w:lang w:val="en-US"/>
+        </w:rPr>
+      </w:pPr>
+    </w:p>
+    <w:p>
+      <w:pPr>
+        <w:jc w:val="center"/>
+        <w:rPr>
+          <w:rFonts w:hint="default" w:ascii="SimSun" w:hAnsi="SimSun" w:eastAsia="SimSun" w:cs="SimSun"/>
+          <w:sz w:val="24"/>
+          <w:szCs w:val="24"/>
+          <w:lang w:val="en-US"/>
+        </w:rPr>
+      </w:pPr>
+      <w:r>
+        <w:rPr>
+          <w:rFonts w:hint="default" w:ascii="SimSun" w:hAnsi="SimSun" w:eastAsia="SimSun" w:cs="SimSun"/>
+          <w:sz w:val="24"/>
+          <w:szCs w:val="24"/>
+          <w:lang w:val="en-US"/>
+        </w:rPr>
+        <w:t>ML Pipeline</w:t>
+      </w:r>
+    </w:p>
+    <w:p>
+      <w:pPr>
+        <w:jc w:val="center"/>
+        <w:rPr>
+          <w:rFonts w:hint="default" w:ascii="SimSun" w:hAnsi="SimSun" w:eastAsia="SimSun" w:cs="SimSun"/>
+          <w:sz w:val="24"/>
+          <w:szCs w:val="24"/>
+          <w:lang w:val="en-US"/>
+        </w:rPr>
+      </w:pPr>
+      <w:r>
+        <w:rPr>
+          <w:rFonts w:hint="default" w:ascii="SimSun" w:hAnsi="SimSun" w:eastAsia="SimSun" w:cs="SimSun"/>
+          <w:sz w:val="24"/>
+          <w:szCs w:val="24"/>
+          <w:lang w:val="en-US"/>
+        </w:rPr>
+        <w:t>│</w:t>
+      </w:r>
+    </w:p>
+    <w:p>
+      <w:pPr>
+        <w:jc w:val="center"/>
+        <w:rPr>
+          <w:rFonts w:hint="default" w:ascii="SimSun" w:hAnsi="SimSun" w:eastAsia="SimSun" w:cs="SimSun"/>
+          <w:sz w:val="24"/>
+          <w:szCs w:val="24"/>
+          <w:lang w:val="en-US"/>
+        </w:rPr>
+      </w:pPr>
+      <w:r>
+        <w:rPr>
+          <w:rFonts w:hint="default" w:ascii="SimSun" w:hAnsi="SimSun" w:eastAsia="SimSun" w:cs="SimSun"/>
+          <w:sz w:val="24"/>
+          <w:szCs w:val="24"/>
+          <w:lang w:val="en-US"/>
+        </w:rPr>
+        <w:t>▼</w:t>
+      </w:r>
+    </w:p>
+    <w:p>
+      <w:pPr>
+        <w:jc w:val="center"/>
+        <w:rPr>
+          <w:rFonts w:hint="default" w:ascii="SimSun" w:hAnsi="SimSun" w:eastAsia="SimSun" w:cs="SimSun"/>
+          <w:sz w:val="24"/>
+          <w:szCs w:val="24"/>
+          <w:lang w:val="en-US"/>
+        </w:rPr>
+      </w:pPr>
+      <w:r>
+        <w:rPr>
+          <w:rFonts w:hint="default" w:ascii="SimSun" w:hAnsi="SimSun" w:eastAsia="SimSun" w:cs="SimSun"/>
+          <w:sz w:val="24"/>
+          <w:szCs w:val="24"/>
+          <w:lang w:val="en-US"/>
+        </w:rPr>
+        <w:t>Feature Engineering</w:t>
+      </w:r>
+    </w:p>
+    <w:p>
+      <w:pPr>
+        <w:jc w:val="center"/>
+        <w:rPr>
+          <w:rFonts w:hint="default" w:ascii="SimSun" w:hAnsi="SimSun" w:eastAsia="SimSun" w:cs="SimSun"/>
+          <w:sz w:val="24"/>
+          <w:szCs w:val="24"/>
+          <w:lang w:val="en-US"/>
+        </w:rPr>
+      </w:pPr>
+      <w:r>
+        <w:rPr>
+          <w:rFonts w:hint="default" w:ascii="SimSun" w:hAnsi="SimSun" w:eastAsia="SimSun" w:cs="SimSun"/>
+          <w:sz w:val="24"/>
+          <w:szCs w:val="24"/>
+          <w:lang w:val="en-US"/>
+        </w:rPr>
+        <w:t>│</w:t>
+      </w:r>
+    </w:p>
+    <w:p>
+      <w:pPr>
+        <w:jc w:val="center"/>
+        <w:rPr>
+          <w:rFonts w:hint="default" w:ascii="SimSun" w:hAnsi="SimSun" w:eastAsia="SimSun" w:cs="SimSun"/>
+          <w:sz w:val="24"/>
+          <w:szCs w:val="24"/>
+          <w:lang w:val="en-US"/>
+        </w:rPr>
+      </w:pPr>
+      <w:r>
+        <w:rPr>
+          <w:rFonts w:hint="default" w:ascii="SimSun" w:hAnsi="SimSun" w:eastAsia="SimSun" w:cs="SimSun"/>
+          <w:sz w:val="24"/>
+          <w:szCs w:val="24"/>
+          <w:lang w:val="en-US"/>
+        </w:rPr>
+        <w:t>▼</w:t>
+      </w:r>
+    </w:p>
+    <w:p>
+      <w:pPr>
+        <w:jc w:val="center"/>
+        <w:rPr>
+          <w:rFonts w:hint="default" w:ascii="SimSun" w:hAnsi="SimSun" w:eastAsia="SimSun" w:cs="SimSun"/>
+          <w:sz w:val="24"/>
+          <w:szCs w:val="24"/>
+          <w:lang w:val="en-US"/>
+        </w:rPr>
+      </w:pPr>
+      <w:r>
+        <w:rPr>
+          <w:rFonts w:hint="default" w:ascii="SimSun" w:hAnsi="SimSun" w:eastAsia="SimSun" w:cs="SimSun"/>
+          <w:sz w:val="24"/>
+          <w:szCs w:val="24"/>
+          <w:lang w:val="en-US"/>
+        </w:rPr>
+        <w:t>XGBoost Training</w:t>
+      </w:r>
+    </w:p>
+    <w:p>
+      <w:pPr>
+        <w:jc w:val="center"/>
+        <w:rPr>
+          <w:rFonts w:hint="default" w:ascii="SimSun" w:hAnsi="SimSun" w:eastAsia="SimSun" w:cs="SimSun"/>
+          <w:sz w:val="24"/>
+          <w:szCs w:val="24"/>
+          <w:lang w:val="en-US"/>
+        </w:rPr>
+      </w:pPr>
+      <w:r>
+        <w:rPr>
+          <w:rFonts w:hint="default" w:ascii="SimSun" w:hAnsi="SimSun" w:eastAsia="SimSun" w:cs="SimSun"/>
+          <w:sz w:val="24"/>
+          <w:szCs w:val="24"/>
+          <w:lang w:val="en-US"/>
+        </w:rPr>
+        <w:t>│</w:t>
+      </w:r>
+    </w:p>
+    <w:p>
+      <w:pPr>
+        <w:jc w:val="center"/>
+        <w:rPr>
+          <w:rFonts w:hint="default" w:ascii="SimSun" w:hAnsi="SimSun" w:eastAsia="SimSun" w:cs="SimSun"/>
+          <w:sz w:val="24"/>
+          <w:szCs w:val="24"/>
+          <w:lang w:val="en-US"/>
+        </w:rPr>
+      </w:pPr>
+      <w:r>
+        <w:rPr>
+          <w:rFonts w:hint="default" w:ascii="SimSun" w:hAnsi="SimSun" w:eastAsia="SimSun" w:cs="SimSun"/>
+          <w:sz w:val="24"/>
+          <w:szCs w:val="24"/>
+          <w:lang w:val="en-US"/>
+        </w:rPr>
+        <w:t>▼</w:t>
+      </w:r>
+    </w:p>
+    <w:p>
+      <w:pPr>
+        <w:jc w:val="center"/>
+        <w:rPr>
+          <w:rFonts w:hint="default" w:ascii="SimSun" w:hAnsi="SimSun" w:eastAsia="SimSun" w:cs="SimSun"/>
+          <w:sz w:val="24"/>
+          <w:szCs w:val="24"/>
+          <w:lang w:val="en-US"/>
+        </w:rPr>
+      </w:pPr>
+      <w:r>
+        <w:rPr>
+          <w:rFonts w:hint="default" w:ascii="SimSun" w:hAnsi="SimSun" w:eastAsia="SimSun" w:cs="SimSun"/>
+          <w:sz w:val="24"/>
+          <w:szCs w:val="24"/>
+          <w:lang w:val="en-US"/>
+        </w:rPr>
+        <w:t>Model Evaluation</w:t>
+      </w:r>
+    </w:p>
+    <w:p>
+      <w:pPr>
+        <w:jc w:val="center"/>
+        <w:rPr>
+          <w:rFonts w:hint="default" w:ascii="SimSun" w:hAnsi="SimSun" w:eastAsia="SimSun" w:cs="SimSun"/>
+          <w:sz w:val="24"/>
+          <w:szCs w:val="24"/>
+          <w:lang w:val="en-US"/>
+        </w:rPr>
+      </w:pPr>
+      <w:r>
+        <w:rPr>
+          <w:rFonts w:hint="default" w:ascii="SimSun" w:hAnsi="SimSun" w:eastAsia="SimSun" w:cs="SimSun"/>
+          <w:sz w:val="24"/>
+          <w:szCs w:val="24"/>
+          <w:lang w:val="en-US"/>
+        </w:rPr>
+        <w:t>│</w:t>
+      </w:r>
+    </w:p>
+    <w:p>
+      <w:pPr>
+        <w:jc w:val="center"/>
+        <w:rPr>
+          <w:rFonts w:hint="default" w:ascii="SimSun" w:hAnsi="SimSun" w:eastAsia="SimSun" w:cs="SimSun"/>
+          <w:sz w:val="24"/>
+          <w:szCs w:val="24"/>
+          <w:lang w:val="en-US"/>
+        </w:rPr>
+      </w:pPr>
+      <w:r>
+        <w:rPr>
+          <w:rFonts w:hint="default" w:ascii="SimSun" w:hAnsi="SimSun" w:eastAsia="SimSun" w:cs="SimSun"/>
+          <w:sz w:val="24"/>
+          <w:szCs w:val="24"/>
+          <w:lang w:val="en-US"/>
+        </w:rPr>
+        <w:t>▼</w:t>
+      </w:r>
+    </w:p>
+    <w:p>
+      <w:pPr>
+        <w:jc w:val="center"/>
+        <w:rPr>
+          <w:rFonts w:hint="default" w:ascii="SimSun" w:hAnsi="SimSun" w:eastAsia="SimSun" w:cs="SimSun"/>
+          <w:sz w:val="24"/>
+          <w:szCs w:val="24"/>
+          <w:lang w:val="en-US"/>
+        </w:rPr>
+      </w:pPr>
+      <w:r>
+        <w:rPr>
+          <w:rFonts w:hint="default" w:ascii="SimSun" w:hAnsi="SimSun" w:eastAsia="SimSun" w:cs="SimSun"/>
+          <w:sz w:val="24"/>
+          <w:szCs w:val="24"/>
+          <w:lang w:val="en-US"/>
+        </w:rPr>
+        <w:t>SHAP Explainability</w:t>
+      </w:r>
+    </w:p>
+    <w:p>
+      <w:pPr>
+        <w:jc w:val="center"/>
+        <w:rPr>
+          <w:rFonts w:hint="default" w:ascii="SimSun" w:hAnsi="SimSun" w:eastAsia="SimSun" w:cs="SimSun"/>
+          <w:sz w:val="24"/>
+          <w:szCs w:val="24"/>
+          <w:lang w:val="en-US"/>
+        </w:rPr>
+      </w:pPr>
+      <w:r>
+        <w:rPr>
+          <w:rFonts w:hint="default" w:ascii="SimSun" w:hAnsi="SimSun" w:eastAsia="SimSun" w:cs="SimSun"/>
+          <w:sz w:val="24"/>
+          <w:szCs w:val="24"/>
+          <w:lang w:val="en-US"/>
+        </w:rPr>
+        <w:t>│</w:t>
+      </w:r>
+    </w:p>
+    <w:p>
+      <w:pPr>
+        <w:jc w:val="center"/>
+        <w:rPr>
+          <w:rFonts w:hint="default" w:ascii="SimSun" w:hAnsi="SimSun" w:eastAsia="SimSun" w:cs="SimSun"/>
+          <w:sz w:val="24"/>
+          <w:szCs w:val="24"/>
+          <w:lang w:val="en-US"/>
+        </w:rPr>
+      </w:pPr>
+      <w:r>
+        <w:rPr>
+          <w:rFonts w:hint="default" w:ascii="SimSun" w:hAnsi="SimSun" w:eastAsia="SimSun" w:cs="SimSun"/>
+          <w:sz w:val="24"/>
+          <w:szCs w:val="24"/>
+          <w:lang w:val="en-US"/>
+        </w:rPr>
+        <w:t>▼</w:t>
+      </w:r>
+    </w:p>
+    <w:p>
+      <w:pPr>
+        <w:jc w:val="center"/>
+        <w:rPr>
+          <w:rFonts w:hint="default" w:ascii="SimSun" w:hAnsi="SimSun" w:eastAsia="SimSun" w:cs="SimSun"/>
+          <w:sz w:val="24"/>
+          <w:szCs w:val="24"/>
+          <w:lang w:val="en-US"/>
+        </w:rPr>
+      </w:pPr>
+      <w:r>
+        <w:rPr>
+          <w:rFonts w:hint="default" w:ascii="SimSun" w:hAnsi="SimSun" w:eastAsia="SimSun" w:cs="SimSun"/>
+          <w:sz w:val="24"/>
+          <w:szCs w:val="24"/>
+          <w:lang w:val="en-US"/>
+        </w:rPr>
+        <w:t>Model Loader</w:t>
+      </w:r>
+    </w:p>
+    <w:p>
+      <w:pPr>
+        <w:jc w:val="center"/>
+        <w:rPr>
+          <w:rFonts w:hint="default" w:ascii="SimSun" w:hAnsi="SimSun" w:eastAsia="SimSun" w:cs="SimSun"/>
+          <w:sz w:val="24"/>
+          <w:szCs w:val="24"/>
+          <w:lang w:val="en-US"/>
+        </w:rPr>
+      </w:pPr>
+      <w:r>
+        <w:rPr>
+          <w:rFonts w:hint="default" w:ascii="SimSun" w:hAnsi="SimSun" w:eastAsia="SimSun" w:cs="SimSun"/>
+          <w:sz w:val="24"/>
+          <w:szCs w:val="24"/>
+          <w:lang w:val="en-US"/>
+        </w:rPr>
+        <w:t>│</w:t>
+      </w:r>
+    </w:p>
+    <w:p>
+      <w:pPr>
+        <w:jc w:val="center"/>
+        <w:rPr>
+          <w:rFonts w:hint="default" w:ascii="SimSun" w:hAnsi="SimSun" w:eastAsia="SimSun" w:cs="SimSun"/>
+          <w:sz w:val="24"/>
+          <w:szCs w:val="24"/>
+          <w:lang w:val="en-US"/>
+        </w:rPr>
+      </w:pPr>
+      <w:r>
+        <w:rPr>
+          <w:rFonts w:hint="default" w:ascii="SimSun" w:hAnsi="SimSun" w:eastAsia="SimSun" w:cs="SimSun"/>
+          <w:sz w:val="24"/>
+          <w:szCs w:val="24"/>
+          <w:lang w:val="en-US"/>
+        </w:rPr>
+        <w:t>┌──────────────┼──────────────┐</w:t>
+      </w:r>
+    </w:p>
+    <w:p>
+      <w:pPr>
+        <w:jc w:val="center"/>
+        <w:rPr>
+          <w:rFonts w:hint="default" w:ascii="SimSun" w:hAnsi="SimSun" w:eastAsia="SimSun" w:cs="SimSun"/>
+          <w:sz w:val="24"/>
+          <w:szCs w:val="24"/>
+          <w:lang w:val="en-US"/>
+        </w:rPr>
+      </w:pPr>
+      <w:r>
+        <w:rPr>
+          <w:rFonts w:hint="default" w:ascii="SimSun" w:hAnsi="SimSun" w:eastAsia="SimSun" w:cs="SimSun"/>
+          <w:sz w:val="24"/>
+          <w:szCs w:val="24"/>
+          <w:lang w:val="en-US"/>
+        </w:rPr>
+        <w:t>▼              ▼              ▼</w:t>
+      </w:r>
+    </w:p>
+    <w:p>
+      <w:pPr>
+        <w:jc w:val="center"/>
+        <w:rPr>
+          <w:rFonts w:hint="default" w:ascii="SimSun" w:hAnsi="SimSun" w:eastAsia="SimSun" w:cs="SimSun"/>
+          <w:sz w:val="24"/>
+          <w:szCs w:val="24"/>
+          <w:lang w:val="en-US"/>
+        </w:rPr>
+      </w:pPr>
+      <w:r>
+        <w:rPr>
+          <w:rFonts w:hint="default" w:ascii="SimSun" w:hAnsi="SimSun" w:eastAsia="SimSun" w:cs="SimSun"/>
+          <w:sz w:val="24"/>
+          <w:szCs w:val="24"/>
+          <w:lang w:val="en-US"/>
+        </w:rPr>
+        <w:t>ForecastService AttributionService SimulationService</w:t>
+      </w:r>
+    </w:p>
+    <w:p>
+      <w:pPr>
+        <w:jc w:val="center"/>
+        <w:rPr>
+          <w:rFonts w:hint="default" w:ascii="SimSun" w:hAnsi="SimSun" w:eastAsia="SimSun" w:cs="SimSun"/>
+          <w:sz w:val="24"/>
+          <w:szCs w:val="24"/>
+          <w:lang w:val="en-US"/>
+        </w:rPr>
+      </w:pPr>
+      <w:r>
+        <w:rPr>
+          <w:rFonts w:hint="default" w:ascii="SimSun" w:hAnsi="SimSun" w:eastAsia="SimSun" w:cs="SimSun"/>
+          <w:sz w:val="24"/>
+          <w:szCs w:val="24"/>
+          <w:lang w:val="en-US"/>
+        </w:rPr>
+        <w:t>│</w:t>
+      </w:r>
+    </w:p>
+    <w:p>
+      <w:pPr>
+        <w:jc w:val="center"/>
+        <w:rPr>
+          <w:rFonts w:hint="default" w:ascii="SimSun" w:hAnsi="SimSun" w:eastAsia="SimSun" w:cs="SimSun"/>
+          <w:sz w:val="24"/>
+          <w:szCs w:val="24"/>
+          <w:lang w:val="en-US"/>
+        </w:rPr>
+      </w:pPr>
+      <w:r>
+        <w:rPr>
+          <w:rFonts w:hint="default" w:ascii="SimSun" w:hAnsi="SimSun" w:eastAsia="SimSun" w:cs="SimSun"/>
+          <w:sz w:val="24"/>
+          <w:szCs w:val="24"/>
+          <w:lang w:val="en-US"/>
+        </w:rPr>
+        <w:t>▼</w:t>
+      </w:r>
+    </w:p>
+    <w:p>
+      <w:pPr>
+        <w:jc w:val="center"/>
+        <w:rPr>
+          <w:rFonts w:hint="default" w:ascii="SimSun" w:hAnsi="SimSun" w:eastAsia="SimSun" w:cs="SimSun"/>
+          <w:sz w:val="24"/>
+          <w:szCs w:val="24"/>
+          <w:lang w:val="en-US"/>
+        </w:rPr>
+      </w:pPr>
+      <w:r>
+        <w:rPr>
+          <w:rFonts w:hint="default" w:ascii="SimSun" w:hAnsi="SimSun" w:eastAsia="SimSun" w:cs="SimSun"/>
+          <w:sz w:val="24"/>
+          <w:szCs w:val="24"/>
+          <w:lang w:val="en-US"/>
+        </w:rPr>
+        <w:t>AdvisoryService</w:t>
+      </w:r>
+    </w:p>
+    <w:p>
+      <w:pPr>
+        <w:jc w:val="center"/>
+        <w:rPr>
+          <w:rFonts w:hint="default" w:ascii="SimSun" w:hAnsi="SimSun" w:eastAsia="SimSun" w:cs="SimSun"/>
+          <w:sz w:val="24"/>
+          <w:szCs w:val="24"/>
+          <w:lang w:val="en-US"/>
+        </w:rPr>
+      </w:pPr>
+      <w:r>
+        <w:rPr>
+          <w:rFonts w:hint="default" w:ascii="SimSun" w:hAnsi="SimSun" w:eastAsia="SimSun" w:cs="SimSun"/>
+          <w:sz w:val="24"/>
+          <w:szCs w:val="24"/>
+          <w:lang w:val="en-US"/>
+        </w:rPr>
+        <w:t>│</w:t>
+      </w:r>
+    </w:p>
+    <w:p>
+      <w:pPr>
+        <w:jc w:val="center"/>
+        <w:rPr>
+          <w:rFonts w:hint="default" w:ascii="SimSun" w:hAnsi="SimSun" w:eastAsia="SimSun" w:cs="SimSun"/>
+          <w:sz w:val="24"/>
+          <w:szCs w:val="24"/>
+          <w:lang w:val="en-US"/>
+        </w:rPr>
+      </w:pPr>
+      <w:r>
+        <w:rPr>
+          <w:rFonts w:hint="default" w:ascii="SimSun" w:hAnsi="SimSun" w:eastAsia="SimSun" w:cs="SimSun"/>
+          <w:sz w:val="24"/>
+          <w:szCs w:val="24"/>
+          <w:lang w:val="en-US"/>
+        </w:rPr>
+        <w:t>▼</w:t>
+      </w:r>
+    </w:p>
+    <w:p>
+      <w:pPr>
+        <w:jc w:val="center"/>
+        <w:rPr>
+          <w:rFonts w:hint="default" w:ascii="SimSun" w:hAnsi="SimSun" w:eastAsia="SimSun" w:cs="SimSun"/>
+          <w:sz w:val="24"/>
+          <w:szCs w:val="24"/>
+          <w:lang w:val="en-US"/>
+        </w:rPr>
+      </w:pPr>
+      <w:r>
+        <w:rPr>
+          <w:rFonts w:hint="default" w:ascii="SimSun" w:hAnsi="SimSun" w:eastAsia="SimSun" w:cs="SimSun"/>
+          <w:sz w:val="24"/>
+          <w:szCs w:val="24"/>
+          <w:lang w:val="en-US"/>
+        </w:rPr>
+        <w:t>FastAPI Routes</w:t>
+      </w:r>
+    </w:p>
+    <w:p>
+      <w:pPr>
+        <w:jc w:val="center"/>
+        <w:rPr>
+          <w:rFonts w:hint="default" w:ascii="SimSun" w:hAnsi="SimSun" w:eastAsia="SimSun" w:cs="SimSun"/>
+          <w:sz w:val="24"/>
+          <w:szCs w:val="24"/>
+          <w:lang w:val="en-US"/>
+        </w:rPr>
+      </w:pPr>
+      <w:r>
+        <w:rPr>
+          <w:rFonts w:hint="default" w:ascii="SimSun" w:hAnsi="SimSun" w:eastAsia="SimSun" w:cs="SimSun"/>
+          <w:sz w:val="24"/>
+          <w:szCs w:val="24"/>
+          <w:lang w:val="en-US"/>
+        </w:rPr>
+        <w:t>│</w:t>
+      </w:r>
+    </w:p>
+    <w:p>
+      <w:pPr>
+        <w:jc w:val="center"/>
+        <w:rPr>
+          <w:rFonts w:hint="default" w:ascii="SimSun" w:hAnsi="SimSun" w:eastAsia="SimSun" w:cs="SimSun"/>
+          <w:sz w:val="24"/>
+          <w:szCs w:val="24"/>
+          <w:lang w:val="en-US"/>
+        </w:rPr>
+      </w:pPr>
+      <w:r>
+        <w:rPr>
+          <w:rFonts w:hint="default" w:ascii="SimSun" w:hAnsi="SimSun" w:eastAsia="SimSun" w:cs="SimSun"/>
+          <w:sz w:val="24"/>
+          <w:szCs w:val="24"/>
+          <w:lang w:val="en-US"/>
+        </w:rPr>
+        <w:t>▼</w:t>
+      </w:r>
+    </w:p>
+    <w:p>
+      <w:pPr>
+        <w:jc w:val="center"/>
+        <w:rPr>
+          <w:rFonts w:hint="default" w:ascii="SimSun" w:hAnsi="SimSun" w:eastAsia="SimSun" w:cs="SimSun"/>
+          <w:sz w:val="24"/>
+          <w:szCs w:val="24"/>
+          <w:lang w:val="en-US"/>
+        </w:rPr>
+      </w:pPr>
+      <w:r>
+        <w:rPr>
+          <w:rFonts w:hint="default" w:ascii="SimSun" w:hAnsi="SimSun" w:eastAsia="SimSun" w:cs="SimSun"/>
+          <w:sz w:val="24"/>
+          <w:szCs w:val="24"/>
+          <w:lang w:val="en-US"/>
+        </w:rPr>
+        <w:t>Swagger Docs ✅</w:t>
+      </w:r>
+    </w:p>
+    <w:p>
+      <w:pPr>
+        <w:jc w:val="center"/>
+        <w:rPr>
+          <w:rFonts w:hint="default" w:ascii="SimSun" w:hAnsi="SimSun" w:eastAsia="SimSun" w:cs="SimSun"/>
+          <w:sz w:val="24"/>
+          <w:szCs w:val="24"/>
+          <w:lang w:val="en-US"/>
+        </w:rPr>
+      </w:pPr>
+    </w:p>
+    <w:p>
+      <w:pPr>
+        <w:jc w:val="center"/>
+        <w:rPr>
+          <w:rFonts w:hint="default" w:ascii="SimSun" w:hAnsi="SimSun" w:eastAsia="SimSun" w:cs="SimSun"/>
+          <w:sz w:val="24"/>
+          <w:szCs w:val="24"/>
+          <w:lang w:val="en-US"/>
+        </w:rPr>
+      </w:pPr>
+    </w:p>
+    <w:p>
+      <w:pPr>
+        <w:jc w:val="center"/>
+        <w:rPr>
+          <w:rFonts w:hint="default" w:ascii="SimSun" w:hAnsi="SimSun" w:eastAsia="SimSun" w:cs="SimSun"/>
+          <w:sz w:val="24"/>
+          <w:szCs w:val="24"/>
+          <w:lang w:val="en-US"/>
+        </w:rPr>
+      </w:pPr>
+    </w:p>
+    <w:p>
+      <w:pPr>
+        <w:jc w:val="both"/>
+        <w:rPr>
+          <w:rFonts w:hint="default" w:ascii="SimSun" w:hAnsi="SimSun" w:eastAsia="SimSun" w:cs="SimSun"/>
+          <w:sz w:val="24"/>
+          <w:szCs w:val="24"/>
+          <w:lang w:val="en-US"/>
+        </w:rPr>
+      </w:pPr>
+    </w:p>
+    <w:p>
+      <w:pPr>
+        <w:jc w:val="center"/>
+        <w:rPr>
+          <w:rFonts w:hint="default" w:ascii="SimSun" w:hAnsi="SimSun" w:eastAsia="SimSun" w:cs="SimSun"/>
+          <w:sz w:val="24"/>
+          <w:szCs w:val="24"/>
+          <w:lang w:val="en-US"/>
+        </w:rPr>
+      </w:pPr>
+    </w:p>
+    <w:p>
+      <w:pPr>
+        <w:jc w:val="left"/>
+        <w:rPr>
+          <w:rFonts w:hint="default" w:ascii="SimSun" w:hAnsi="SimSun" w:eastAsia="SimSun" w:cs="SimSun"/>
+          <w:sz w:val="22"/>
+          <w:szCs w:val="22"/>
+          <w:lang w:val="en-US"/>
+        </w:rPr>
+      </w:pPr>
+      <w:r>
+        <w:rPr>
+          <w:rFonts w:hint="default" w:ascii="SimSun" w:hAnsi="SimSun" w:eastAsia="SimSun" w:cs="SimSun"/>
+          <w:sz w:val="22"/>
+          <w:szCs w:val="22"/>
+          <w:lang w:val="en-US"/>
+        </w:rPr>
+        <w:t>PHASE 1</w:t>
+      </w:r>
+    </w:p>
+    <w:p>
+      <w:pPr>
+        <w:jc w:val="left"/>
+        <w:rPr>
+          <w:rFonts w:hint="default" w:ascii="SimSun" w:hAnsi="SimSun" w:eastAsia="SimSun" w:cs="SimSun"/>
+          <w:sz w:val="22"/>
+          <w:szCs w:val="22"/>
+          <w:lang w:val="en-US"/>
+        </w:rPr>
+      </w:pPr>
+      <w:r>
+        <w:rPr>
+          <w:rFonts w:hint="default" w:ascii="SimSun" w:hAnsi="SimSun" w:eastAsia="SimSun" w:cs="SimSun"/>
+          <w:sz w:val="22"/>
+          <w:szCs w:val="22"/>
+          <w:lang w:val="en-US"/>
+        </w:rPr>
+        <w:t>Infrastructure</w:t>
+      </w:r>
+    </w:p>
+    <w:p>
+      <w:pPr>
+        <w:jc w:val="left"/>
+        <w:rPr>
+          <w:rFonts w:hint="default" w:ascii="SimSun" w:hAnsi="SimSun" w:eastAsia="SimSun" w:cs="SimSun"/>
+          <w:sz w:val="22"/>
+          <w:szCs w:val="22"/>
+          <w:lang w:val="en-US"/>
+        </w:rPr>
+      </w:pPr>
+      <w:r>
+        <w:rPr>
+          <w:rFonts w:hint="default" w:ascii="SimSun" w:hAnsi="SimSun" w:eastAsia="SimSun" w:cs="SimSun"/>
+          <w:sz w:val="22"/>
+          <w:szCs w:val="22"/>
+          <w:lang w:val="en-US"/>
+        </w:rPr>
+        <w:t>│</w:t>
+      </w:r>
+    </w:p>
+    <w:p>
+      <w:pPr>
+        <w:jc w:val="left"/>
+        <w:rPr>
+          <w:rFonts w:hint="default" w:ascii="SimSun" w:hAnsi="SimSun" w:eastAsia="SimSun" w:cs="SimSun"/>
+          <w:sz w:val="22"/>
+          <w:szCs w:val="22"/>
+          <w:lang w:val="en-US"/>
+        </w:rPr>
+      </w:pPr>
+      <w:r>
+        <w:rPr>
+          <w:rFonts w:hint="default" w:ascii="SimSun" w:hAnsi="SimSun" w:eastAsia="SimSun" w:cs="SimSun"/>
+          <w:sz w:val="22"/>
+          <w:szCs w:val="22"/>
+          <w:lang w:val="en-US"/>
+        </w:rPr>
+        <w:t>├── API Client</w:t>
+      </w:r>
+    </w:p>
+    <w:p>
+      <w:pPr>
+        <w:jc w:val="left"/>
+        <w:rPr>
+          <w:rFonts w:hint="default" w:ascii="SimSun" w:hAnsi="SimSun" w:eastAsia="SimSun" w:cs="SimSun"/>
+          <w:sz w:val="22"/>
+          <w:szCs w:val="22"/>
+          <w:lang w:val="en-US"/>
+        </w:rPr>
+      </w:pPr>
+      <w:r>
+        <w:rPr>
+          <w:rFonts w:hint="default" w:ascii="SimSun" w:hAnsi="SimSun" w:eastAsia="SimSun" w:cs="SimSun"/>
+          <w:sz w:val="22"/>
+          <w:szCs w:val="22"/>
+          <w:lang w:val="en-US"/>
+        </w:rPr>
+        <w:t>├── Types</w:t>
+      </w:r>
+    </w:p>
+    <w:p>
+      <w:pPr>
+        <w:jc w:val="left"/>
+        <w:rPr>
+          <w:rFonts w:hint="default" w:ascii="SimSun" w:hAnsi="SimSun" w:eastAsia="SimSun" w:cs="SimSun"/>
+          <w:sz w:val="22"/>
+          <w:szCs w:val="22"/>
+          <w:lang w:val="en-US"/>
+        </w:rPr>
+      </w:pPr>
+      <w:r>
+        <w:rPr>
+          <w:rFonts w:hint="default" w:ascii="SimSun" w:hAnsi="SimSun" w:eastAsia="SimSun" w:cs="SimSun"/>
+          <w:sz w:val="22"/>
+          <w:szCs w:val="22"/>
+          <w:lang w:val="en-US"/>
+        </w:rPr>
+        <w:t>├── Services</w:t>
+      </w:r>
+    </w:p>
+    <w:p>
+      <w:pPr>
+        <w:jc w:val="left"/>
+        <w:rPr>
+          <w:rFonts w:hint="default" w:ascii="SimSun" w:hAnsi="SimSun" w:eastAsia="SimSun" w:cs="SimSun"/>
+          <w:sz w:val="22"/>
+          <w:szCs w:val="22"/>
+          <w:lang w:val="en-US"/>
+        </w:rPr>
+      </w:pPr>
+      <w:r>
+        <w:rPr>
+          <w:rFonts w:hint="default" w:ascii="SimSun" w:hAnsi="SimSun" w:eastAsia="SimSun" w:cs="SimSun"/>
+          <w:sz w:val="22"/>
+          <w:szCs w:val="22"/>
+          <w:lang w:val="en-US"/>
+        </w:rPr>
+        <w:t>├── Zustand</w:t>
+      </w:r>
+    </w:p>
+    <w:p>
+      <w:pPr>
+        <w:jc w:val="left"/>
+        <w:rPr>
+          <w:rFonts w:hint="default" w:ascii="SimSun" w:hAnsi="SimSun" w:eastAsia="SimSun" w:cs="SimSun"/>
+          <w:sz w:val="22"/>
+          <w:szCs w:val="22"/>
+          <w:lang w:val="en-US"/>
+        </w:rPr>
+      </w:pPr>
+      <w:r>
+        <w:rPr>
+          <w:rFonts w:hint="default" w:ascii="SimSun" w:hAnsi="SimSun" w:eastAsia="SimSun" w:cs="SimSun"/>
+          <w:sz w:val="22"/>
+          <w:szCs w:val="22"/>
+          <w:lang w:val="en-US"/>
+        </w:rPr>
+        <w:t>└── Test Page</w:t>
+      </w:r>
+    </w:p>
+    <w:p>
+      <w:pPr>
+        <w:jc w:val="left"/>
+        <w:rPr>
+          <w:rFonts w:hint="default" w:ascii="SimSun" w:hAnsi="SimSun" w:eastAsia="SimSun" w:cs="SimSun"/>
+          <w:sz w:val="22"/>
+          <w:szCs w:val="22"/>
+          <w:lang w:val="en-US"/>
+        </w:rPr>
+      </w:pPr>
+      <w:r>
+        <w:rPr>
+          <w:rFonts w:hint="default" w:ascii="SimSun" w:hAnsi="SimSun" w:eastAsia="SimSun" w:cs="SimSun"/>
+          <w:sz w:val="22"/>
+          <w:szCs w:val="22"/>
+          <w:lang w:val="en-US"/>
+        </w:rPr>
+        <w:t>│</w:t>
+      </w:r>
+    </w:p>
+    <w:p>
+      <w:pPr>
+        <w:jc w:val="left"/>
+        <w:rPr>
+          <w:rFonts w:hint="default" w:ascii="SimSun" w:hAnsi="SimSun" w:eastAsia="SimSun" w:cs="SimSun"/>
+          <w:sz w:val="22"/>
+          <w:szCs w:val="22"/>
+          <w:lang w:val="en-US"/>
+        </w:rPr>
+      </w:pPr>
+      <w:r>
+        <w:rPr>
+          <w:rFonts w:hint="default" w:ascii="SimSun" w:hAnsi="SimSun" w:eastAsia="SimSun" w:cs="SimSun"/>
+          <w:sz w:val="22"/>
+          <w:szCs w:val="22"/>
+          <w:lang w:val="en-US"/>
+        </w:rPr>
+        <w:t>▼</w:t>
+      </w:r>
+    </w:p>
+    <w:p>
+      <w:pPr>
+        <w:jc w:val="left"/>
+        <w:rPr>
+          <w:rFonts w:hint="default" w:ascii="SimSun" w:hAnsi="SimSun" w:eastAsia="SimSun" w:cs="SimSun"/>
+          <w:sz w:val="22"/>
+          <w:szCs w:val="22"/>
+          <w:lang w:val="en-US"/>
+        </w:rPr>
+      </w:pPr>
+      <w:r>
+        <w:rPr>
+          <w:rFonts w:hint="default" w:ascii="SimSun" w:hAnsi="SimSun" w:eastAsia="SimSun" w:cs="SimSun"/>
+          <w:sz w:val="22"/>
+          <w:szCs w:val="22"/>
+          <w:lang w:val="en-US"/>
+        </w:rPr>
+        <w:t>PHASE 2</w:t>
+      </w:r>
+    </w:p>
+    <w:p>
+      <w:pPr>
+        <w:jc w:val="left"/>
+        <w:rPr>
+          <w:rFonts w:hint="default" w:ascii="SimSun" w:hAnsi="SimSun" w:eastAsia="SimSun" w:cs="SimSun"/>
+          <w:sz w:val="22"/>
+          <w:szCs w:val="22"/>
+          <w:lang w:val="en-US"/>
+        </w:rPr>
+      </w:pPr>
+      <w:r>
+        <w:rPr>
+          <w:rFonts w:hint="default" w:ascii="SimSun" w:hAnsi="SimSun" w:eastAsia="SimSun" w:cs="SimSun"/>
+          <w:sz w:val="22"/>
+          <w:szCs w:val="22"/>
+          <w:lang w:val="en-US"/>
+        </w:rPr>
+        <w:t>Application Shell</w:t>
+      </w:r>
+    </w:p>
+    <w:p>
+      <w:pPr>
+        <w:jc w:val="left"/>
+        <w:rPr>
+          <w:rFonts w:hint="default" w:ascii="SimSun" w:hAnsi="SimSun" w:eastAsia="SimSun" w:cs="SimSun"/>
+          <w:sz w:val="22"/>
+          <w:szCs w:val="22"/>
+          <w:lang w:val="en-US"/>
+        </w:rPr>
+      </w:pPr>
+      <w:r>
+        <w:rPr>
+          <w:rFonts w:hint="default" w:ascii="SimSun" w:hAnsi="SimSun" w:eastAsia="SimSun" w:cs="SimSun"/>
+          <w:sz w:val="22"/>
+          <w:szCs w:val="22"/>
+          <w:lang w:val="en-US"/>
+        </w:rPr>
+        <w:t>│</w:t>
+      </w:r>
+    </w:p>
+    <w:p>
+      <w:pPr>
+        <w:jc w:val="left"/>
+        <w:rPr>
+          <w:rFonts w:hint="default" w:ascii="SimSun" w:hAnsi="SimSun" w:eastAsia="SimSun" w:cs="SimSun"/>
+          <w:sz w:val="22"/>
+          <w:szCs w:val="22"/>
+          <w:lang w:val="en-US"/>
+        </w:rPr>
+      </w:pPr>
+      <w:r>
+        <w:rPr>
+          <w:rFonts w:hint="default" w:ascii="SimSun" w:hAnsi="SimSun" w:eastAsia="SimSun" w:cs="SimSun"/>
+          <w:sz w:val="22"/>
+          <w:szCs w:val="22"/>
+          <w:lang w:val="en-US"/>
+        </w:rPr>
+        <w:t>├── Sidebar</w:t>
+      </w:r>
+    </w:p>
+    <w:p>
+      <w:pPr>
+        <w:jc w:val="left"/>
+        <w:rPr>
+          <w:rFonts w:hint="default" w:ascii="SimSun" w:hAnsi="SimSun" w:eastAsia="SimSun" w:cs="SimSun"/>
+          <w:sz w:val="22"/>
+          <w:szCs w:val="22"/>
+          <w:lang w:val="en-US"/>
+        </w:rPr>
+      </w:pPr>
+      <w:r>
+        <w:rPr>
+          <w:rFonts w:hint="default" w:ascii="SimSun" w:hAnsi="SimSun" w:eastAsia="SimSun" w:cs="SimSun"/>
+          <w:sz w:val="22"/>
+          <w:szCs w:val="22"/>
+          <w:lang w:val="en-US"/>
+        </w:rPr>
+        <w:t>├── Navbar</w:t>
+      </w:r>
+    </w:p>
+    <w:p>
+      <w:pPr>
+        <w:jc w:val="left"/>
+        <w:rPr>
+          <w:rFonts w:hint="default" w:ascii="SimSun" w:hAnsi="SimSun" w:eastAsia="SimSun" w:cs="SimSun"/>
+          <w:sz w:val="22"/>
+          <w:szCs w:val="22"/>
+          <w:lang w:val="en-US"/>
+        </w:rPr>
+      </w:pPr>
+      <w:r>
+        <w:rPr>
+          <w:rFonts w:hint="default" w:ascii="SimSun" w:hAnsi="SimSun" w:eastAsia="SimSun" w:cs="SimSun"/>
+          <w:sz w:val="22"/>
+          <w:szCs w:val="22"/>
+          <w:lang w:val="en-US"/>
+        </w:rPr>
+        <w:t>├── Layout</w:t>
+      </w:r>
+    </w:p>
+    <w:p>
+      <w:pPr>
+        <w:jc w:val="left"/>
+        <w:rPr>
+          <w:rFonts w:hint="default" w:ascii="SimSun" w:hAnsi="SimSun" w:eastAsia="SimSun" w:cs="SimSun"/>
+          <w:sz w:val="22"/>
+          <w:szCs w:val="22"/>
+          <w:lang w:val="en-US"/>
+        </w:rPr>
+      </w:pPr>
+      <w:r>
+        <w:rPr>
+          <w:rFonts w:hint="default" w:ascii="SimSun" w:hAnsi="SimSun" w:eastAsia="SimSun" w:cs="SimSun"/>
+          <w:sz w:val="22"/>
+          <w:szCs w:val="22"/>
+          <w:lang w:val="en-US"/>
+        </w:rPr>
+        <w:t>└── Routing</w:t>
+      </w:r>
+    </w:p>
+    <w:p>
+      <w:pPr>
+        <w:jc w:val="left"/>
+        <w:rPr>
+          <w:rFonts w:hint="default" w:ascii="SimSun" w:hAnsi="SimSun" w:eastAsia="SimSun" w:cs="SimSun"/>
+          <w:sz w:val="22"/>
+          <w:szCs w:val="22"/>
+          <w:lang w:val="en-US"/>
+        </w:rPr>
+      </w:pPr>
+      <w:r>
+        <w:rPr>
+          <w:rFonts w:hint="default" w:ascii="SimSun" w:hAnsi="SimSun" w:eastAsia="SimSun" w:cs="SimSun"/>
+          <w:sz w:val="22"/>
+          <w:szCs w:val="22"/>
+          <w:lang w:val="en-US"/>
+        </w:rPr>
+        <w:t>│</w:t>
+      </w:r>
+    </w:p>
+    <w:p>
+      <w:pPr>
+        <w:jc w:val="left"/>
+        <w:rPr>
+          <w:rFonts w:hint="default" w:ascii="SimSun" w:hAnsi="SimSun" w:eastAsia="SimSun" w:cs="SimSun"/>
+          <w:sz w:val="22"/>
+          <w:szCs w:val="22"/>
+          <w:lang w:val="en-US"/>
+        </w:rPr>
+      </w:pPr>
+      <w:r>
+        <w:rPr>
+          <w:rFonts w:hint="default" w:ascii="SimSun" w:hAnsi="SimSun" w:eastAsia="SimSun" w:cs="SimSun"/>
+          <w:sz w:val="22"/>
+          <w:szCs w:val="22"/>
+          <w:lang w:val="en-US"/>
+        </w:rPr>
+        <w:t>▼</w:t>
+      </w:r>
+    </w:p>
+    <w:p>
+      <w:pPr>
+        <w:jc w:val="left"/>
+        <w:rPr>
+          <w:rFonts w:hint="default" w:ascii="SimSun" w:hAnsi="SimSun" w:eastAsia="SimSun" w:cs="SimSun"/>
+          <w:sz w:val="22"/>
+          <w:szCs w:val="22"/>
+          <w:lang w:val="en-US"/>
+        </w:rPr>
+      </w:pPr>
+      <w:r>
+        <w:rPr>
+          <w:rFonts w:hint="default" w:ascii="SimSun" w:hAnsi="SimSun" w:eastAsia="SimSun" w:cs="SimSun"/>
+          <w:sz w:val="22"/>
+          <w:szCs w:val="22"/>
+          <w:lang w:val="en-US"/>
+        </w:rPr>
+        <w:t>PHASE 3</w:t>
+      </w:r>
+    </w:p>
+    <w:p>
+      <w:pPr>
+        <w:jc w:val="left"/>
+        <w:rPr>
+          <w:rFonts w:hint="default" w:ascii="SimSun" w:hAnsi="SimSun" w:eastAsia="SimSun" w:cs="SimSun"/>
+          <w:sz w:val="22"/>
+          <w:szCs w:val="22"/>
+          <w:lang w:val="en-US"/>
+        </w:rPr>
+      </w:pPr>
+      <w:r>
+        <w:rPr>
+          <w:rFonts w:hint="default" w:ascii="SimSun" w:hAnsi="SimSun" w:eastAsia="SimSun" w:cs="SimSun"/>
+          <w:sz w:val="22"/>
+          <w:szCs w:val="22"/>
+          <w:lang w:val="en-US"/>
+        </w:rPr>
+        <w:t>Dashboard</w:t>
+      </w:r>
+    </w:p>
+    <w:p>
+      <w:pPr>
+        <w:jc w:val="left"/>
+        <w:rPr>
+          <w:rFonts w:hint="default" w:ascii="SimSun" w:hAnsi="SimSun" w:eastAsia="SimSun" w:cs="SimSun"/>
+          <w:sz w:val="22"/>
+          <w:szCs w:val="22"/>
+          <w:lang w:val="en-US"/>
+        </w:rPr>
+      </w:pPr>
+      <w:r>
+        <w:rPr>
+          <w:rFonts w:hint="default" w:ascii="SimSun" w:hAnsi="SimSun" w:eastAsia="SimSun" w:cs="SimSun"/>
+          <w:sz w:val="22"/>
+          <w:szCs w:val="22"/>
+          <w:lang w:val="en-US"/>
+        </w:rPr>
+        <w:t>│</w:t>
+      </w:r>
+    </w:p>
+    <w:p>
+      <w:pPr>
+        <w:jc w:val="left"/>
+        <w:rPr>
+          <w:rFonts w:hint="default" w:ascii="SimSun" w:hAnsi="SimSun" w:eastAsia="SimSun" w:cs="SimSun"/>
+          <w:sz w:val="22"/>
+          <w:szCs w:val="22"/>
+          <w:lang w:val="en-US"/>
+        </w:rPr>
+      </w:pPr>
+      <w:r>
+        <w:rPr>
+          <w:rFonts w:hint="default" w:ascii="SimSun" w:hAnsi="SimSun" w:eastAsia="SimSun" w:cs="SimSun"/>
+          <w:sz w:val="22"/>
+          <w:szCs w:val="22"/>
+          <w:lang w:val="en-US"/>
+        </w:rPr>
+        <w:t>├── Metric Cards</w:t>
+      </w:r>
+    </w:p>
+    <w:p>
+      <w:pPr>
+        <w:jc w:val="left"/>
+        <w:rPr>
+          <w:rFonts w:hint="default" w:ascii="SimSun" w:hAnsi="SimSun" w:eastAsia="SimSun" w:cs="SimSun"/>
+          <w:sz w:val="22"/>
+          <w:szCs w:val="22"/>
+          <w:lang w:val="en-US"/>
+        </w:rPr>
+      </w:pPr>
+      <w:r>
+        <w:rPr>
+          <w:rFonts w:hint="default" w:ascii="SimSun" w:hAnsi="SimSun" w:eastAsia="SimSun" w:cs="SimSun"/>
+          <w:sz w:val="22"/>
+          <w:szCs w:val="22"/>
+          <w:lang w:val="en-US"/>
+        </w:rPr>
+        <w:t>├── Forecast Summary</w:t>
+      </w:r>
+    </w:p>
+    <w:p>
+      <w:pPr>
+        <w:jc w:val="left"/>
+        <w:rPr>
+          <w:rFonts w:hint="default" w:ascii="SimSun" w:hAnsi="SimSun" w:eastAsia="SimSun" w:cs="SimSun"/>
+          <w:sz w:val="22"/>
+          <w:szCs w:val="22"/>
+          <w:lang w:val="en-US"/>
+        </w:rPr>
+      </w:pPr>
+      <w:r>
+        <w:rPr>
+          <w:rFonts w:hint="default" w:ascii="SimSun" w:hAnsi="SimSun" w:eastAsia="SimSun" w:cs="SimSun"/>
+          <w:sz w:val="22"/>
+          <w:szCs w:val="22"/>
+          <w:lang w:val="en-US"/>
+        </w:rPr>
+        <w:t>├── AQI Status</w:t>
+      </w:r>
+    </w:p>
+    <w:p>
+      <w:pPr>
+        <w:jc w:val="left"/>
+        <w:rPr>
+          <w:rFonts w:hint="default" w:ascii="SimSun" w:hAnsi="SimSun" w:eastAsia="SimSun" w:cs="SimSun"/>
+          <w:sz w:val="22"/>
+          <w:szCs w:val="22"/>
+          <w:lang w:val="en-US"/>
+        </w:rPr>
+      </w:pPr>
+      <w:r>
+        <w:rPr>
+          <w:rFonts w:hint="default" w:ascii="SimSun" w:hAnsi="SimSun" w:eastAsia="SimSun" w:cs="SimSun"/>
+          <w:sz w:val="22"/>
+          <w:szCs w:val="22"/>
+          <w:lang w:val="en-US"/>
+        </w:rPr>
+        <w:t>└── Advisory</w:t>
+      </w:r>
+    </w:p>
+    <w:p>
+      <w:pPr>
+        <w:jc w:val="left"/>
+        <w:rPr>
+          <w:rFonts w:hint="default" w:ascii="SimSun" w:hAnsi="SimSun" w:eastAsia="SimSun" w:cs="SimSun"/>
+          <w:sz w:val="22"/>
+          <w:szCs w:val="22"/>
+          <w:lang w:val="en-US"/>
+        </w:rPr>
+      </w:pPr>
+      <w:r>
+        <w:rPr>
+          <w:rFonts w:hint="default" w:ascii="SimSun" w:hAnsi="SimSun" w:eastAsia="SimSun" w:cs="SimSun"/>
+          <w:sz w:val="22"/>
+          <w:szCs w:val="22"/>
+          <w:lang w:val="en-US"/>
+        </w:rPr>
+        <w:t>│</w:t>
+      </w:r>
+    </w:p>
+    <w:p>
+      <w:pPr>
+        <w:jc w:val="left"/>
+        <w:rPr>
+          <w:rFonts w:hint="default" w:ascii="SimSun" w:hAnsi="SimSun" w:eastAsia="SimSun" w:cs="SimSun"/>
+          <w:sz w:val="22"/>
+          <w:szCs w:val="22"/>
+          <w:lang w:val="en-US"/>
+        </w:rPr>
+      </w:pPr>
+      <w:r>
+        <w:rPr>
+          <w:rFonts w:hint="default" w:ascii="SimSun" w:hAnsi="SimSun" w:eastAsia="SimSun" w:cs="SimSun"/>
+          <w:sz w:val="22"/>
+          <w:szCs w:val="22"/>
+          <w:lang w:val="en-US"/>
+        </w:rPr>
+        <w:t>▼</w:t>
+      </w:r>
+    </w:p>
+    <w:p>
+      <w:pPr>
+        <w:jc w:val="left"/>
+        <w:rPr>
+          <w:rFonts w:hint="default" w:ascii="SimSun" w:hAnsi="SimSun" w:eastAsia="SimSun" w:cs="SimSun"/>
+          <w:sz w:val="22"/>
+          <w:szCs w:val="22"/>
+          <w:lang w:val="en-US"/>
+        </w:rPr>
+      </w:pPr>
+      <w:r>
+        <w:rPr>
+          <w:rFonts w:hint="default" w:ascii="SimSun" w:hAnsi="SimSun" w:eastAsia="SimSun" w:cs="SimSun"/>
+          <w:sz w:val="22"/>
+          <w:szCs w:val="22"/>
+          <w:lang w:val="en-US"/>
+        </w:rPr>
+        <w:t>PHASE 4</w:t>
+      </w:r>
+    </w:p>
+    <w:p>
+      <w:pPr>
+        <w:jc w:val="left"/>
+        <w:rPr>
+          <w:rFonts w:hint="default" w:ascii="SimSun" w:hAnsi="SimSun" w:eastAsia="SimSun" w:cs="SimSun"/>
+          <w:sz w:val="22"/>
+          <w:szCs w:val="22"/>
+          <w:lang w:val="en-US"/>
+        </w:rPr>
+      </w:pPr>
+      <w:r>
+        <w:rPr>
+          <w:rFonts w:hint="default" w:ascii="SimSun" w:hAnsi="SimSun" w:eastAsia="SimSun" w:cs="SimSun"/>
+          <w:sz w:val="22"/>
+          <w:szCs w:val="22"/>
+          <w:lang w:val="en-US"/>
+        </w:rPr>
+        <w:t>Map</w:t>
+      </w:r>
+    </w:p>
+    <w:p>
+      <w:pPr>
+        <w:jc w:val="left"/>
+        <w:rPr>
+          <w:rFonts w:hint="default" w:ascii="SimSun" w:hAnsi="SimSun" w:eastAsia="SimSun" w:cs="SimSun"/>
+          <w:sz w:val="22"/>
+          <w:szCs w:val="22"/>
+          <w:lang w:val="en-US"/>
+        </w:rPr>
+      </w:pPr>
+      <w:r>
+        <w:rPr>
+          <w:rFonts w:hint="default" w:ascii="SimSun" w:hAnsi="SimSun" w:eastAsia="SimSun" w:cs="SimSun"/>
+          <w:sz w:val="22"/>
+          <w:szCs w:val="22"/>
+          <w:lang w:val="en-US"/>
+        </w:rPr>
+        <w:t>│</w:t>
+      </w:r>
+    </w:p>
+    <w:p>
+      <w:pPr>
+        <w:jc w:val="left"/>
+        <w:rPr>
+          <w:rFonts w:hint="default" w:ascii="SimSun" w:hAnsi="SimSun" w:eastAsia="SimSun" w:cs="SimSun"/>
+          <w:sz w:val="22"/>
+          <w:szCs w:val="22"/>
+          <w:lang w:val="en-US"/>
+        </w:rPr>
+      </w:pPr>
+      <w:r>
+        <w:rPr>
+          <w:rFonts w:hint="default" w:ascii="SimSun" w:hAnsi="SimSun" w:eastAsia="SimSun" w:cs="SimSun"/>
+          <w:sz w:val="22"/>
+          <w:szCs w:val="22"/>
+          <w:lang w:val="en-US"/>
+        </w:rPr>
+        <w:t>├── MapTiler</w:t>
+      </w:r>
+    </w:p>
+    <w:p>
+      <w:pPr>
+        <w:jc w:val="left"/>
+        <w:rPr>
+          <w:rFonts w:hint="default" w:ascii="SimSun" w:hAnsi="SimSun" w:eastAsia="SimSun" w:cs="SimSun"/>
+          <w:sz w:val="22"/>
+          <w:szCs w:val="22"/>
+          <w:lang w:val="en-US"/>
+        </w:rPr>
+      </w:pPr>
+      <w:r>
+        <w:rPr>
+          <w:rFonts w:hint="default" w:ascii="SimSun" w:hAnsi="SimSun" w:eastAsia="SimSun" w:cs="SimSun"/>
+          <w:sz w:val="22"/>
+          <w:szCs w:val="22"/>
+          <w:lang w:val="en-US"/>
+        </w:rPr>
+        <w:t>├── GeoJSON</w:t>
+      </w:r>
+    </w:p>
+    <w:p>
+      <w:pPr>
+        <w:jc w:val="left"/>
+        <w:rPr>
+          <w:rFonts w:hint="default" w:ascii="SimSun" w:hAnsi="SimSun" w:eastAsia="SimSun" w:cs="SimSun"/>
+          <w:sz w:val="22"/>
+          <w:szCs w:val="22"/>
+          <w:lang w:val="en-US"/>
+        </w:rPr>
+      </w:pPr>
+      <w:r>
+        <w:rPr>
+          <w:rFonts w:hint="default" w:ascii="SimSun" w:hAnsi="SimSun" w:eastAsia="SimSun" w:cs="SimSun"/>
+          <w:sz w:val="22"/>
+          <w:szCs w:val="22"/>
+          <w:lang w:val="en-US"/>
+        </w:rPr>
+        <w:t>├── AQI Stations</w:t>
+      </w:r>
+    </w:p>
+    <w:p>
+      <w:pPr>
+        <w:jc w:val="left"/>
+        <w:rPr>
+          <w:rFonts w:hint="default" w:ascii="SimSun" w:hAnsi="SimSun" w:eastAsia="SimSun" w:cs="SimSun"/>
+          <w:sz w:val="22"/>
+          <w:szCs w:val="22"/>
+          <w:lang w:val="en-US"/>
+        </w:rPr>
+      </w:pPr>
+      <w:r>
+        <w:rPr>
+          <w:rFonts w:hint="default" w:ascii="SimSun" w:hAnsi="SimSun" w:eastAsia="SimSun" w:cs="SimSun"/>
+          <w:sz w:val="22"/>
+          <w:szCs w:val="22"/>
+          <w:lang w:val="en-US"/>
+        </w:rPr>
+        <w:t>└── Station Selection</w:t>
+      </w:r>
+    </w:p>
+    <w:p>
+      <w:pPr>
+        <w:jc w:val="left"/>
+        <w:rPr>
+          <w:rFonts w:hint="default" w:ascii="SimSun" w:hAnsi="SimSun" w:eastAsia="SimSun" w:cs="SimSun"/>
+          <w:sz w:val="22"/>
+          <w:szCs w:val="22"/>
+          <w:lang w:val="en-US"/>
+        </w:rPr>
+      </w:pPr>
+      <w:r>
+        <w:rPr>
+          <w:rFonts w:hint="default" w:ascii="SimSun" w:hAnsi="SimSun" w:eastAsia="SimSun" w:cs="SimSun"/>
+          <w:sz w:val="22"/>
+          <w:szCs w:val="22"/>
+          <w:lang w:val="en-US"/>
+        </w:rPr>
+        <w:t>│</w:t>
+      </w:r>
+    </w:p>
+    <w:p>
+      <w:pPr>
+        <w:jc w:val="left"/>
+        <w:rPr>
+          <w:rFonts w:hint="default" w:ascii="SimSun" w:hAnsi="SimSun" w:eastAsia="SimSun" w:cs="SimSun"/>
+          <w:sz w:val="22"/>
+          <w:szCs w:val="22"/>
+          <w:lang w:val="en-US"/>
+        </w:rPr>
+      </w:pPr>
+      <w:r>
+        <w:rPr>
+          <w:rFonts w:hint="default" w:ascii="SimSun" w:hAnsi="SimSun" w:eastAsia="SimSun" w:cs="SimSun"/>
+          <w:sz w:val="22"/>
+          <w:szCs w:val="22"/>
+          <w:lang w:val="en-US"/>
+        </w:rPr>
+        <w:t>▼</w:t>
+      </w:r>
+    </w:p>
+    <w:p>
+      <w:pPr>
+        <w:jc w:val="left"/>
+        <w:rPr>
+          <w:rFonts w:hint="default" w:ascii="SimSun" w:hAnsi="SimSun" w:eastAsia="SimSun" w:cs="SimSun"/>
+          <w:sz w:val="22"/>
+          <w:szCs w:val="22"/>
+          <w:lang w:val="en-US"/>
+        </w:rPr>
+      </w:pPr>
+      <w:r>
+        <w:rPr>
+          <w:rFonts w:hint="default" w:ascii="SimSun" w:hAnsi="SimSun" w:eastAsia="SimSun" w:cs="SimSun"/>
+          <w:sz w:val="22"/>
+          <w:szCs w:val="22"/>
+          <w:lang w:val="en-US"/>
+        </w:rPr>
+        <w:t>PHASE 5</w:t>
+      </w:r>
+    </w:p>
+    <w:p>
+      <w:pPr>
+        <w:jc w:val="left"/>
+        <w:rPr>
+          <w:rFonts w:hint="default" w:ascii="SimSun" w:hAnsi="SimSun" w:eastAsia="SimSun" w:cs="SimSun"/>
+          <w:sz w:val="22"/>
+          <w:szCs w:val="22"/>
+          <w:lang w:val="en-US"/>
+        </w:rPr>
+      </w:pPr>
+      <w:r>
+        <w:rPr>
+          <w:rFonts w:hint="default" w:ascii="SimSun" w:hAnsi="SimSun" w:eastAsia="SimSun" w:cs="SimSun"/>
+          <w:sz w:val="22"/>
+          <w:szCs w:val="22"/>
+          <w:lang w:val="en-US"/>
+        </w:rPr>
+        <w:t>Forecast</w:t>
+      </w:r>
+    </w:p>
+    <w:p>
+      <w:pPr>
+        <w:jc w:val="left"/>
+        <w:rPr>
+          <w:rFonts w:hint="default" w:ascii="SimSun" w:hAnsi="SimSun" w:eastAsia="SimSun" w:cs="SimSun"/>
+          <w:sz w:val="22"/>
+          <w:szCs w:val="22"/>
+          <w:lang w:val="en-US"/>
+        </w:rPr>
+      </w:pPr>
+      <w:r>
+        <w:rPr>
+          <w:rFonts w:hint="default" w:ascii="SimSun" w:hAnsi="SimSun" w:eastAsia="SimSun" w:cs="SimSun"/>
+          <w:sz w:val="22"/>
+          <w:szCs w:val="22"/>
+          <w:lang w:val="en-US"/>
+        </w:rPr>
+        <w:t>│</w:t>
+      </w:r>
+    </w:p>
+    <w:p>
+      <w:pPr>
+        <w:jc w:val="left"/>
+        <w:rPr>
+          <w:rFonts w:hint="default" w:ascii="SimSun" w:hAnsi="SimSun" w:eastAsia="SimSun" w:cs="SimSun"/>
+          <w:sz w:val="22"/>
+          <w:szCs w:val="22"/>
+          <w:lang w:val="en-US"/>
+        </w:rPr>
+      </w:pPr>
+      <w:r>
+        <w:rPr>
+          <w:rFonts w:hint="default" w:ascii="SimSun" w:hAnsi="SimSun" w:eastAsia="SimSun" w:cs="SimSun"/>
+          <w:sz w:val="22"/>
+          <w:szCs w:val="22"/>
+          <w:lang w:val="en-US"/>
+        </w:rPr>
+        <w:t>▼</w:t>
+      </w:r>
+    </w:p>
+    <w:p>
+      <w:pPr>
+        <w:jc w:val="left"/>
+        <w:rPr>
+          <w:rFonts w:hint="default" w:ascii="SimSun" w:hAnsi="SimSun" w:eastAsia="SimSun" w:cs="SimSun"/>
+          <w:sz w:val="22"/>
+          <w:szCs w:val="22"/>
+          <w:lang w:val="en-US"/>
+        </w:rPr>
+      </w:pPr>
+      <w:r>
+        <w:rPr>
+          <w:rFonts w:hint="default" w:ascii="SimSun" w:hAnsi="SimSun" w:eastAsia="SimSun" w:cs="SimSun"/>
+          <w:sz w:val="22"/>
+          <w:szCs w:val="22"/>
+          <w:lang w:val="en-US"/>
+        </w:rPr>
+        <w:t>PHASE 6</w:t>
+      </w:r>
+    </w:p>
+    <w:p>
+      <w:pPr>
+        <w:jc w:val="left"/>
+        <w:rPr>
+          <w:rFonts w:hint="default" w:ascii="SimSun" w:hAnsi="SimSun" w:eastAsia="SimSun" w:cs="SimSun"/>
+          <w:sz w:val="22"/>
+          <w:szCs w:val="22"/>
+          <w:lang w:val="en-US"/>
+        </w:rPr>
+      </w:pPr>
+      <w:r>
+        <w:rPr>
+          <w:rFonts w:hint="default" w:ascii="SimSun" w:hAnsi="SimSun" w:eastAsia="SimSun" w:cs="SimSun"/>
+          <w:sz w:val="22"/>
+          <w:szCs w:val="22"/>
+          <w:lang w:val="en-US"/>
+        </w:rPr>
+        <w:t>Source Attribution</w:t>
+      </w:r>
+    </w:p>
+    <w:p>
+      <w:pPr>
+        <w:jc w:val="left"/>
+        <w:rPr>
+          <w:rFonts w:hint="default" w:ascii="SimSun" w:hAnsi="SimSun" w:eastAsia="SimSun" w:cs="SimSun"/>
+          <w:sz w:val="22"/>
+          <w:szCs w:val="22"/>
+          <w:lang w:val="en-US"/>
+        </w:rPr>
+      </w:pPr>
+      <w:r>
+        <w:rPr>
+          <w:rFonts w:hint="default" w:ascii="SimSun" w:hAnsi="SimSun" w:eastAsia="SimSun" w:cs="SimSun"/>
+          <w:sz w:val="22"/>
+          <w:szCs w:val="22"/>
+          <w:lang w:val="en-US"/>
+        </w:rPr>
+        <w:t>│</w:t>
+      </w:r>
+    </w:p>
+    <w:p>
+      <w:pPr>
+        <w:jc w:val="left"/>
+        <w:rPr>
+          <w:rFonts w:hint="default" w:ascii="SimSun" w:hAnsi="SimSun" w:eastAsia="SimSun" w:cs="SimSun"/>
+          <w:sz w:val="22"/>
+          <w:szCs w:val="22"/>
+          <w:lang w:val="en-US"/>
+        </w:rPr>
+      </w:pPr>
+      <w:r>
+        <w:rPr>
+          <w:rFonts w:hint="default" w:ascii="SimSun" w:hAnsi="SimSun" w:eastAsia="SimSun" w:cs="SimSun"/>
+          <w:sz w:val="22"/>
+          <w:szCs w:val="22"/>
+          <w:lang w:val="en-US"/>
+        </w:rPr>
+        <w:t>▼</w:t>
+      </w:r>
+    </w:p>
+    <w:p>
+      <w:pPr>
+        <w:jc w:val="left"/>
+        <w:rPr>
+          <w:rFonts w:hint="default" w:ascii="SimSun" w:hAnsi="SimSun" w:eastAsia="SimSun" w:cs="SimSun"/>
+          <w:sz w:val="22"/>
+          <w:szCs w:val="22"/>
+          <w:lang w:val="en-US"/>
+        </w:rPr>
+      </w:pPr>
+      <w:r>
+        <w:rPr>
+          <w:rFonts w:hint="default" w:ascii="SimSun" w:hAnsi="SimSun" w:eastAsia="SimSun" w:cs="SimSun"/>
+          <w:sz w:val="22"/>
+          <w:szCs w:val="22"/>
+          <w:lang w:val="en-US"/>
+        </w:rPr>
+        <w:t>PHASE 7</w:t>
+      </w:r>
+    </w:p>
+    <w:p>
+      <w:pPr>
+        <w:jc w:val="left"/>
+        <w:rPr>
+          <w:rFonts w:hint="default" w:ascii="SimSun" w:hAnsi="SimSun" w:eastAsia="SimSun" w:cs="SimSun"/>
+          <w:sz w:val="22"/>
+          <w:szCs w:val="22"/>
+          <w:lang w:val="en-US"/>
+        </w:rPr>
+      </w:pPr>
+      <w:r>
+        <w:rPr>
+          <w:rFonts w:hint="default" w:ascii="SimSun" w:hAnsi="SimSun" w:eastAsia="SimSun" w:cs="SimSun"/>
+          <w:sz w:val="22"/>
+          <w:szCs w:val="22"/>
+          <w:lang w:val="en-US"/>
+        </w:rPr>
+        <w:t>Simulation</w:t>
+      </w:r>
+    </w:p>
+    <w:p>
+      <w:pPr>
+        <w:jc w:val="left"/>
+        <w:rPr>
+          <w:rFonts w:hint="default" w:ascii="SimSun" w:hAnsi="SimSun" w:eastAsia="SimSun" w:cs="SimSun"/>
+          <w:sz w:val="22"/>
+          <w:szCs w:val="22"/>
+          <w:lang w:val="en-US"/>
+        </w:rPr>
+      </w:pPr>
+      <w:r>
+        <w:rPr>
+          <w:rFonts w:hint="default" w:ascii="SimSun" w:hAnsi="SimSun" w:eastAsia="SimSun" w:cs="SimSun"/>
+          <w:sz w:val="22"/>
+          <w:szCs w:val="22"/>
+          <w:lang w:val="en-US"/>
+        </w:rPr>
+        <w:t>│</w:t>
+      </w:r>
+    </w:p>
+    <w:p>
+      <w:pPr>
+        <w:jc w:val="left"/>
+        <w:rPr>
+          <w:rFonts w:hint="default" w:ascii="SimSun" w:hAnsi="SimSun" w:eastAsia="SimSun" w:cs="SimSun"/>
+          <w:sz w:val="22"/>
+          <w:szCs w:val="22"/>
+          <w:lang w:val="en-US"/>
+        </w:rPr>
+      </w:pPr>
+      <w:r>
+        <w:rPr>
+          <w:rFonts w:hint="default" w:ascii="SimSun" w:hAnsi="SimSun" w:eastAsia="SimSun" w:cs="SimSun"/>
+          <w:sz w:val="22"/>
+          <w:szCs w:val="22"/>
+          <w:lang w:val="en-US"/>
+        </w:rPr>
+        <w:t>▼</w:t>
+      </w:r>
+    </w:p>
+    <w:p>
+      <w:pPr>
+        <w:jc w:val="left"/>
+        <w:rPr>
+          <w:rFonts w:hint="default" w:ascii="SimSun" w:hAnsi="SimSun" w:eastAsia="SimSun" w:cs="SimSun"/>
+          <w:sz w:val="22"/>
+          <w:szCs w:val="22"/>
+          <w:lang w:val="en-US"/>
+        </w:rPr>
+      </w:pPr>
+      <w:r>
+        <w:rPr>
+          <w:rFonts w:hint="default" w:ascii="SimSun" w:hAnsi="SimSun" w:eastAsia="SimSun" w:cs="SimSun"/>
+          <w:sz w:val="22"/>
+          <w:szCs w:val="22"/>
+          <w:lang w:val="en-US"/>
+        </w:rPr>
+        <w:t>PHASE 8</w:t>
+      </w:r>
+    </w:p>
+    <w:p>
+      <w:pPr>
+        <w:jc w:val="left"/>
+        <w:rPr>
+          <w:rFonts w:hint="default" w:ascii="SimSun" w:hAnsi="SimSun" w:eastAsia="SimSun" w:cs="SimSun"/>
+          <w:sz w:val="22"/>
+          <w:szCs w:val="22"/>
+          <w:lang w:val="en-US"/>
+        </w:rPr>
+      </w:pPr>
+      <w:r>
+        <w:rPr>
+          <w:rFonts w:hint="default" w:ascii="SimSun" w:hAnsi="SimSun" w:eastAsia="SimSun" w:cs="SimSun"/>
+          <w:sz w:val="22"/>
+          <w:szCs w:val="22"/>
+          <w:lang w:val="en-US"/>
+        </w:rPr>
+        <w:t>Citizen Advisories</w:t>
+      </w:r>
+    </w:p>
+    <w:p>
+      <w:pPr>
+        <w:jc w:val="left"/>
+        <w:rPr>
+          <w:rFonts w:hint="default" w:ascii="SimSun" w:hAnsi="SimSun" w:eastAsia="SimSun" w:cs="SimSun"/>
+          <w:sz w:val="22"/>
+          <w:szCs w:val="22"/>
+          <w:lang w:val="en-US"/>
+        </w:rPr>
+      </w:pPr>
+      <w:r>
+        <w:rPr>
+          <w:rFonts w:hint="default" w:ascii="SimSun" w:hAnsi="SimSun" w:eastAsia="SimSun" w:cs="SimSun"/>
+          <w:sz w:val="22"/>
+          <w:szCs w:val="22"/>
+          <w:lang w:val="en-US"/>
+        </w:rPr>
+        <w:t>│</w:t>
+      </w:r>
+    </w:p>
+    <w:p>
+      <w:pPr>
+        <w:jc w:val="left"/>
+        <w:rPr>
+          <w:rFonts w:hint="default" w:ascii="SimSun" w:hAnsi="SimSun" w:eastAsia="SimSun" w:cs="SimSun"/>
+          <w:sz w:val="22"/>
+          <w:szCs w:val="22"/>
+          <w:lang w:val="en-US"/>
+        </w:rPr>
+      </w:pPr>
+      <w:r>
+        <w:rPr>
+          <w:rFonts w:hint="default" w:ascii="SimSun" w:hAnsi="SimSun" w:eastAsia="SimSun" w:cs="SimSun"/>
+          <w:sz w:val="22"/>
+          <w:szCs w:val="22"/>
+          <w:lang w:val="en-US"/>
+        </w:rPr>
+        <w:t>▼</w:t>
+      </w:r>
+    </w:p>
+    <w:p>
+      <w:pPr>
+        <w:jc w:val="left"/>
+        <w:rPr>
+          <w:rFonts w:hint="default" w:ascii="SimSun" w:hAnsi="SimSun" w:eastAsia="SimSun" w:cs="SimSun"/>
+          <w:sz w:val="22"/>
+          <w:szCs w:val="22"/>
+          <w:lang w:val="en-US"/>
+        </w:rPr>
+      </w:pPr>
+      <w:r>
+        <w:rPr>
+          <w:rFonts w:hint="default" w:ascii="SimSun" w:hAnsi="SimSun" w:eastAsia="SimSun" w:cs="SimSun"/>
+          <w:sz w:val="22"/>
+          <w:szCs w:val="22"/>
+          <w:lang w:val="en-US"/>
+        </w:rPr>
+        <w:t>PHASE 9</w:t>
+      </w:r>
+    </w:p>
+    <w:p>
+      <w:pPr>
+        <w:jc w:val="left"/>
+        <w:rPr>
+          <w:rFonts w:hint="default" w:ascii="SimSun" w:hAnsi="SimSun" w:eastAsia="SimSun" w:cs="SimSun"/>
+          <w:sz w:val="22"/>
+          <w:szCs w:val="22"/>
+          <w:lang w:val="en-US"/>
+        </w:rPr>
+      </w:pPr>
+      <w:r>
+        <w:rPr>
+          <w:rFonts w:hint="default" w:ascii="SimSun" w:hAnsi="SimSun" w:eastAsia="SimSun" w:cs="SimSun"/>
+          <w:sz w:val="22"/>
+          <w:szCs w:val="22"/>
+          <w:lang w:val="en-US"/>
+        </w:rPr>
+        <w:t>Deployment</w:t>
+      </w:r>
+    </w:p>
+    <w:p>
+      <w:pPr>
+        <w:jc w:val="left"/>
+        <w:rPr>
+          <w:rFonts w:hint="default" w:ascii="SimSun" w:hAnsi="SimSun" w:eastAsia="SimSun" w:cs="SimSun"/>
+          <w:sz w:val="22"/>
+          <w:szCs w:val="22"/>
+          <w:lang w:val="en-US"/>
+        </w:rPr>
+      </w:pPr>
+    </w:p>
+    <w:p>
+      <w:pPr>
+        <w:jc w:val="left"/>
+        <w:rPr>
+          <w:rFonts w:hint="default" w:ascii="SimSun" w:hAnsi="SimSun" w:eastAsia="SimSun" w:cs="SimSun"/>
+          <w:sz w:val="22"/>
+          <w:szCs w:val="22"/>
+          <w:lang w:val="en-US"/>
+        </w:rPr>
+      </w:pPr>
+    </w:p>
+    <w:p>
+      <w:pPr>
+        <w:jc w:val="left"/>
+        <w:rPr>
+          <w:rFonts w:hint="default" w:ascii="SimSun" w:hAnsi="SimSun" w:eastAsia="SimSun" w:cs="SimSun"/>
+          <w:sz w:val="22"/>
+          <w:szCs w:val="22"/>
+          <w:lang w:val="en-US"/>
+        </w:rPr>
+      </w:pPr>
+    </w:p>
+    <w:p>
+      <w:pPr>
+        <w:jc w:val="left"/>
+        <w:rPr>
+          <w:rFonts w:hint="default" w:ascii="SimSun" w:hAnsi="SimSun" w:eastAsia="SimSun" w:cs="SimSun"/>
+          <w:sz w:val="22"/>
+          <w:szCs w:val="22"/>
+          <w:lang w:val="en-US"/>
+        </w:rPr>
+      </w:pPr>
+    </w:p>
+    <w:p>
+      <w:pPr>
+        <w:jc w:val="left"/>
+        <w:rPr>
+          <w:rFonts w:hint="default" w:ascii="SimSun" w:hAnsi="SimSun" w:eastAsia="SimSun" w:cs="SimSun"/>
+          <w:sz w:val="22"/>
+          <w:szCs w:val="22"/>
+          <w:lang w:val="en-US"/>
+        </w:rPr>
+      </w:pPr>
+    </w:p>
+    <w:p>
+      <w:pPr>
+        <w:jc w:val="both"/>
+        <w:rPr>
+          <w:rFonts w:hint="default" w:ascii="SimSun" w:hAnsi="SimSun" w:eastAsia="SimSun" w:cs="SimSun"/>
+          <w:sz w:val="22"/>
+          <w:szCs w:val="22"/>
+          <w:lang w:val="en-US"/>
+        </w:rPr>
+      </w:pPr>
+      <w:r>
+        <w:rPr>
+          <w:rFonts w:hint="default" w:ascii="SimSun" w:hAnsi="SimSun" w:eastAsia="SimSun" w:cs="SimSun"/>
+          <w:sz w:val="22"/>
+          <w:szCs w:val="22"/>
+          <w:lang w:val="en-US"/>
+        </w:rPr>
+        <w:t xml:space="preserve">Design </w:t>
+      </w:r>
+    </w:p>
+    <w:p>
+      <w:pPr>
+        <w:jc w:val="both"/>
+        <w:rPr>
+          <w:rFonts w:hint="default" w:ascii="SimSun" w:hAnsi="SimSun" w:eastAsia="SimSun" w:cs="SimSun"/>
+          <w:sz w:val="22"/>
+          <w:szCs w:val="22"/>
+          <w:lang w:val="en-US"/>
+        </w:rPr>
+      </w:pPr>
+    </w:p>
+    <w:p>
+      <w:pPr>
+        <w:jc w:val="both"/>
+        <w:rPr>
+          <w:rFonts w:hint="default" w:ascii="SimSun" w:hAnsi="SimSun" w:eastAsia="SimSun" w:cs="SimSun"/>
+          <w:sz w:val="22"/>
+          <w:szCs w:val="22"/>
+          <w:lang w:val="en-US"/>
+        </w:rPr>
+      </w:pPr>
+      <w:r>
+        <w:rPr>
+          <w:rFonts w:hint="default" w:ascii="SimSun" w:hAnsi="SimSun" w:eastAsia="SimSun" w:cs="SimSun"/>
+          <w:sz w:val="22"/>
+          <w:szCs w:val="22"/>
+          <w:lang w:val="en-US"/>
+        </w:rPr>
+        <w:t>Background</w:t>
+      </w:r>
+    </w:p>
+    <w:p>
+      <w:pPr>
+        <w:jc w:val="both"/>
+        <w:rPr>
+          <w:rFonts w:hint="default" w:ascii="SimSun" w:hAnsi="SimSun" w:eastAsia="SimSun" w:cs="SimSun"/>
+          <w:sz w:val="22"/>
+          <w:szCs w:val="22"/>
+          <w:lang w:val="en-US"/>
+        </w:rPr>
+      </w:pPr>
+    </w:p>
+    <w:p>
+      <w:pPr>
+        <w:jc w:val="both"/>
+        <w:rPr>
+          <w:rFonts w:hint="default" w:ascii="SimSun" w:hAnsi="SimSun" w:eastAsia="SimSun" w:cs="SimSun"/>
+          <w:sz w:val="22"/>
+          <w:szCs w:val="22"/>
+          <w:lang w:val="en-US"/>
+        </w:rPr>
+      </w:pPr>
+      <w:r>
+        <w:rPr>
+          <w:rFonts w:hint="default" w:ascii="SimSun" w:hAnsi="SimSun" w:eastAsia="SimSun" w:cs="SimSun"/>
+          <w:sz w:val="22"/>
+          <w:szCs w:val="22"/>
+          <w:lang w:val="en-US"/>
+        </w:rPr>
+        <w:t>#F5F7FA</w:t>
+      </w:r>
+    </w:p>
+    <w:p>
+      <w:pPr>
+        <w:jc w:val="both"/>
+        <w:rPr>
+          <w:rFonts w:hint="default" w:ascii="SimSun" w:hAnsi="SimSun" w:eastAsia="SimSun" w:cs="SimSun"/>
+          <w:sz w:val="22"/>
+          <w:szCs w:val="22"/>
+          <w:lang w:val="en-US"/>
+        </w:rPr>
+      </w:pPr>
+    </w:p>
+    <w:p>
+      <w:pPr>
+        <w:jc w:val="both"/>
+        <w:rPr>
+          <w:rFonts w:hint="default" w:ascii="SimSun" w:hAnsi="SimSun" w:eastAsia="SimSun" w:cs="SimSun"/>
+          <w:sz w:val="22"/>
+          <w:szCs w:val="22"/>
+          <w:lang w:val="en-US"/>
+        </w:rPr>
+      </w:pPr>
+      <w:r>
+        <w:rPr>
+          <w:rFonts w:hint="default" w:ascii="SimSun" w:hAnsi="SimSun" w:eastAsia="SimSun" w:cs="SimSun"/>
+          <w:sz w:val="22"/>
+          <w:szCs w:val="22"/>
+          <w:lang w:val="en-US"/>
+        </w:rPr>
+        <w:t>Sidebar</w:t>
+      </w:r>
+    </w:p>
+    <w:p>
+      <w:pPr>
+        <w:jc w:val="both"/>
+        <w:rPr>
+          <w:rFonts w:hint="default" w:ascii="SimSun" w:hAnsi="SimSun" w:eastAsia="SimSun" w:cs="SimSun"/>
+          <w:sz w:val="22"/>
+          <w:szCs w:val="22"/>
+          <w:lang w:val="en-US"/>
+        </w:rPr>
+      </w:pPr>
+    </w:p>
+    <w:p>
+      <w:pPr>
+        <w:jc w:val="both"/>
+        <w:rPr>
+          <w:rFonts w:hint="default" w:ascii="SimSun" w:hAnsi="SimSun" w:eastAsia="SimSun" w:cs="SimSun"/>
+          <w:sz w:val="22"/>
+          <w:szCs w:val="22"/>
+          <w:lang w:val="en-US"/>
+        </w:rPr>
+      </w:pPr>
+      <w:r>
+        <w:rPr>
+          <w:rFonts w:hint="default" w:ascii="SimSun" w:hAnsi="SimSun" w:eastAsia="SimSun" w:cs="SimSun"/>
+          <w:sz w:val="22"/>
+          <w:szCs w:val="22"/>
+          <w:lang w:val="en-US"/>
+        </w:rPr>
+        <w:t>#FFFFFF</w:t>
+      </w:r>
+    </w:p>
+    <w:p>
+      <w:pPr>
+        <w:jc w:val="both"/>
+        <w:rPr>
+          <w:rFonts w:hint="default" w:ascii="SimSun" w:hAnsi="SimSun" w:eastAsia="SimSun" w:cs="SimSun"/>
+          <w:sz w:val="22"/>
+          <w:szCs w:val="22"/>
+          <w:lang w:val="en-US"/>
+        </w:rPr>
+      </w:pPr>
+    </w:p>
+    <w:p>
+      <w:pPr>
+        <w:jc w:val="both"/>
+        <w:rPr>
+          <w:rFonts w:hint="default" w:ascii="SimSun" w:hAnsi="SimSun" w:eastAsia="SimSun" w:cs="SimSun"/>
+          <w:sz w:val="22"/>
+          <w:szCs w:val="22"/>
+          <w:lang w:val="en-US"/>
+        </w:rPr>
+      </w:pPr>
+      <w:r>
+        <w:rPr>
+          <w:rFonts w:hint="default" w:ascii="SimSun" w:hAnsi="SimSun" w:eastAsia="SimSun" w:cs="SimSun"/>
+          <w:sz w:val="22"/>
+          <w:szCs w:val="22"/>
+          <w:lang w:val="en-US"/>
+        </w:rPr>
+        <w:t>Cards</w:t>
+      </w:r>
+    </w:p>
+    <w:p>
+      <w:pPr>
+        <w:jc w:val="both"/>
+        <w:rPr>
+          <w:rFonts w:hint="default" w:ascii="SimSun" w:hAnsi="SimSun" w:eastAsia="SimSun" w:cs="SimSun"/>
+          <w:sz w:val="22"/>
+          <w:szCs w:val="22"/>
+          <w:lang w:val="en-US"/>
+        </w:rPr>
+      </w:pPr>
+    </w:p>
+    <w:p>
+      <w:pPr>
+        <w:jc w:val="both"/>
+        <w:rPr>
+          <w:rFonts w:hint="default" w:ascii="SimSun" w:hAnsi="SimSun" w:eastAsia="SimSun" w:cs="SimSun"/>
+          <w:sz w:val="22"/>
+          <w:szCs w:val="22"/>
+          <w:lang w:val="en-US"/>
+        </w:rPr>
+      </w:pPr>
+      <w:r>
+        <w:rPr>
+          <w:rFonts w:hint="default" w:ascii="SimSun" w:hAnsi="SimSun" w:eastAsia="SimSun" w:cs="SimSun"/>
+          <w:sz w:val="22"/>
+          <w:szCs w:val="22"/>
+          <w:lang w:val="en-US"/>
+        </w:rPr>
+        <w:t>#FFFFFF</w:t>
+      </w:r>
+    </w:p>
+    <w:p>
+      <w:pPr>
+        <w:jc w:val="both"/>
+        <w:rPr>
+          <w:rFonts w:hint="default" w:ascii="SimSun" w:hAnsi="SimSun" w:eastAsia="SimSun" w:cs="SimSun"/>
+          <w:sz w:val="22"/>
+          <w:szCs w:val="22"/>
+          <w:lang w:val="en-US"/>
+        </w:rPr>
+      </w:pPr>
+    </w:p>
+    <w:p>
+      <w:pPr>
+        <w:jc w:val="both"/>
+        <w:rPr>
+          <w:rFonts w:hint="default" w:ascii="SimSun" w:hAnsi="SimSun" w:eastAsia="SimSun" w:cs="SimSun"/>
+          <w:sz w:val="22"/>
+          <w:szCs w:val="22"/>
+          <w:lang w:val="en-US"/>
+        </w:rPr>
+      </w:pPr>
+      <w:r>
+        <w:rPr>
+          <w:rFonts w:hint="default" w:ascii="SimSun" w:hAnsi="SimSun" w:eastAsia="SimSun" w:cs="SimSun"/>
+          <w:sz w:val="22"/>
+          <w:szCs w:val="22"/>
+          <w:lang w:val="en-US"/>
+        </w:rPr>
+        <w:t>Primary</w:t>
+      </w:r>
+    </w:p>
+    <w:p>
+      <w:pPr>
+        <w:jc w:val="both"/>
+        <w:rPr>
+          <w:rFonts w:hint="default" w:ascii="SimSun" w:hAnsi="SimSun" w:eastAsia="SimSun" w:cs="SimSun"/>
+          <w:sz w:val="22"/>
+          <w:szCs w:val="22"/>
+          <w:lang w:val="en-US"/>
+        </w:rPr>
+      </w:pPr>
+    </w:p>
+    <w:p>
+      <w:pPr>
+        <w:jc w:val="both"/>
+        <w:rPr>
+          <w:rFonts w:hint="default" w:ascii="SimSun" w:hAnsi="SimSun" w:eastAsia="SimSun" w:cs="SimSun"/>
+          <w:sz w:val="22"/>
+          <w:szCs w:val="22"/>
+          <w:lang w:val="en-US"/>
+        </w:rPr>
+      </w:pPr>
+      <w:r>
+        <w:rPr>
+          <w:rFonts w:hint="default" w:ascii="SimSun" w:hAnsi="SimSun" w:eastAsia="SimSun" w:cs="SimSun"/>
+          <w:sz w:val="22"/>
+          <w:szCs w:val="22"/>
+          <w:lang w:val="en-US"/>
+        </w:rPr>
+        <w:t>#2563EB</w:t>
+      </w:r>
+    </w:p>
+    <w:p>
+      <w:pPr>
+        <w:jc w:val="both"/>
+        <w:rPr>
+          <w:rFonts w:hint="default" w:ascii="SimSun" w:hAnsi="SimSun" w:eastAsia="SimSun" w:cs="SimSun"/>
+          <w:sz w:val="22"/>
+          <w:szCs w:val="22"/>
+          <w:lang w:val="en-US"/>
+        </w:rPr>
+      </w:pPr>
+    </w:p>
+    <w:p>
+      <w:pPr>
+        <w:jc w:val="both"/>
+        <w:rPr>
+          <w:rFonts w:hint="default" w:ascii="SimSun" w:hAnsi="SimSun" w:eastAsia="SimSun" w:cs="SimSun"/>
+          <w:sz w:val="22"/>
+          <w:szCs w:val="22"/>
+          <w:lang w:val="en-US"/>
+        </w:rPr>
+      </w:pPr>
+      <w:r>
+        <w:rPr>
+          <w:rFonts w:hint="default" w:ascii="SimSun" w:hAnsi="SimSun" w:eastAsia="SimSun" w:cs="SimSun"/>
+          <w:sz w:val="22"/>
+          <w:szCs w:val="22"/>
+          <w:lang w:val="en-US"/>
+        </w:rPr>
+        <w:t>Success</w:t>
+      </w:r>
+    </w:p>
+    <w:p>
+      <w:pPr>
+        <w:jc w:val="both"/>
+        <w:rPr>
+          <w:rFonts w:hint="default" w:ascii="SimSun" w:hAnsi="SimSun" w:eastAsia="SimSun" w:cs="SimSun"/>
+          <w:sz w:val="22"/>
+          <w:szCs w:val="22"/>
+          <w:lang w:val="en-US"/>
+        </w:rPr>
+      </w:pPr>
+    </w:p>
+    <w:p>
+      <w:pPr>
+        <w:jc w:val="both"/>
+        <w:rPr>
+          <w:rFonts w:hint="default" w:ascii="SimSun" w:hAnsi="SimSun" w:eastAsia="SimSun" w:cs="SimSun"/>
+          <w:sz w:val="22"/>
+          <w:szCs w:val="22"/>
+          <w:lang w:val="en-US"/>
+        </w:rPr>
+      </w:pPr>
+      <w:r>
+        <w:rPr>
+          <w:rFonts w:hint="default" w:ascii="SimSun" w:hAnsi="SimSun" w:eastAsia="SimSun" w:cs="SimSun"/>
+          <w:sz w:val="22"/>
+          <w:szCs w:val="22"/>
+          <w:lang w:val="en-US"/>
+        </w:rPr>
+        <w:t>#16A34A</w:t>
+      </w:r>
+    </w:p>
+    <w:p>
+      <w:pPr>
+        <w:jc w:val="both"/>
+        <w:rPr>
+          <w:rFonts w:hint="default" w:ascii="SimSun" w:hAnsi="SimSun" w:eastAsia="SimSun" w:cs="SimSun"/>
+          <w:sz w:val="22"/>
+          <w:szCs w:val="22"/>
+          <w:lang w:val="en-US"/>
+        </w:rPr>
+      </w:pPr>
+    </w:p>
+    <w:p>
+      <w:pPr>
+        <w:jc w:val="both"/>
+        <w:rPr>
+          <w:rFonts w:hint="default" w:ascii="SimSun" w:hAnsi="SimSun" w:eastAsia="SimSun" w:cs="SimSun"/>
+          <w:sz w:val="22"/>
+          <w:szCs w:val="22"/>
+          <w:lang w:val="en-US"/>
+        </w:rPr>
+      </w:pPr>
+      <w:r>
+        <w:rPr>
+          <w:rFonts w:hint="default" w:ascii="SimSun" w:hAnsi="SimSun" w:eastAsia="SimSun" w:cs="SimSun"/>
+          <w:sz w:val="22"/>
+          <w:szCs w:val="22"/>
+          <w:lang w:val="en-US"/>
+        </w:rPr>
+        <w:t>Warning</w:t>
+      </w:r>
+    </w:p>
+    <w:p>
+      <w:pPr>
+        <w:jc w:val="both"/>
+        <w:rPr>
+          <w:rFonts w:hint="default" w:ascii="SimSun" w:hAnsi="SimSun" w:eastAsia="SimSun" w:cs="SimSun"/>
+          <w:sz w:val="22"/>
+          <w:szCs w:val="22"/>
+          <w:lang w:val="en-US"/>
+        </w:rPr>
+      </w:pPr>
+    </w:p>
+    <w:p>
+      <w:pPr>
+        <w:jc w:val="both"/>
+        <w:rPr>
+          <w:rFonts w:hint="default" w:ascii="SimSun" w:hAnsi="SimSun" w:eastAsia="SimSun" w:cs="SimSun"/>
+          <w:sz w:val="22"/>
+          <w:szCs w:val="22"/>
+          <w:lang w:val="en-US"/>
+        </w:rPr>
+      </w:pPr>
+      <w:r>
+        <w:rPr>
+          <w:rFonts w:hint="default" w:ascii="SimSun" w:hAnsi="SimSun" w:eastAsia="SimSun" w:cs="SimSun"/>
+          <w:sz w:val="22"/>
+          <w:szCs w:val="22"/>
+          <w:lang w:val="en-US"/>
+        </w:rPr>
+        <w:t>#FACC15</w:t>
+      </w:r>
+    </w:p>
+    <w:p>
+      <w:pPr>
+        <w:jc w:val="both"/>
+        <w:rPr>
+          <w:rFonts w:hint="default" w:ascii="SimSun" w:hAnsi="SimSun" w:eastAsia="SimSun" w:cs="SimSun"/>
+          <w:sz w:val="22"/>
+          <w:szCs w:val="22"/>
+          <w:lang w:val="en-US"/>
+        </w:rPr>
+      </w:pPr>
+    </w:p>
+    <w:p>
+      <w:pPr>
+        <w:jc w:val="both"/>
+        <w:rPr>
+          <w:rFonts w:hint="default" w:ascii="SimSun" w:hAnsi="SimSun" w:eastAsia="SimSun" w:cs="SimSun"/>
+          <w:sz w:val="22"/>
+          <w:szCs w:val="22"/>
+          <w:lang w:val="en-US"/>
+        </w:rPr>
+      </w:pPr>
+      <w:r>
+        <w:rPr>
+          <w:rFonts w:hint="default" w:ascii="SimSun" w:hAnsi="SimSun" w:eastAsia="SimSun" w:cs="SimSun"/>
+          <w:sz w:val="22"/>
+          <w:szCs w:val="22"/>
+          <w:lang w:val="en-US"/>
+        </w:rPr>
+        <w:t>Danger</w:t>
+      </w:r>
+    </w:p>
+    <w:p>
+      <w:pPr>
+        <w:jc w:val="both"/>
+        <w:rPr>
+          <w:rFonts w:hint="default" w:ascii="SimSun" w:hAnsi="SimSun" w:eastAsia="SimSun" w:cs="SimSun"/>
+          <w:sz w:val="22"/>
+          <w:szCs w:val="22"/>
+          <w:lang w:val="en-US"/>
+        </w:rPr>
+      </w:pPr>
+    </w:p>
+    <w:p>
+      <w:pPr>
+        <w:jc w:val="both"/>
+        <w:rPr>
+          <w:rFonts w:hint="default" w:ascii="SimSun" w:hAnsi="SimSun" w:eastAsia="SimSun" w:cs="SimSun"/>
+          <w:sz w:val="22"/>
+          <w:szCs w:val="22"/>
+          <w:lang w:val="en-US"/>
+        </w:rPr>
+      </w:pPr>
+      <w:r>
+        <w:rPr>
+          <w:rFonts w:hint="default" w:ascii="SimSun" w:hAnsi="SimSun" w:eastAsia="SimSun" w:cs="SimSun"/>
+          <w:sz w:val="22"/>
+          <w:szCs w:val="22"/>
+          <w:lang w:val="en-US"/>
+        </w:rPr>
+        <w:t>#DC2626</w:t>
+      </w:r>
       <w:bookmarkStart w:id="0" w:name="_GoBack"/>
       <w:bookmarkEnd w:id="0"/>
-    </w:p>
-    <w:p>
-      <w:pPr>
-        <w:rPr>
-          <w:rFonts w:hint="default" w:ascii="SimSun" w:hAnsi="SimSun" w:eastAsia="SimSun" w:cs="SimSun"/>
-          <w:sz w:val="24"/>
-          <w:szCs w:val="24"/>
-          <w:lang w:val="en-US"/>
-        </w:rPr>
-      </w:pPr>
-    </w:p>
-    <w:p>
-      <w:pPr>
-        <w:rPr>
-          <w:rFonts w:hint="default" w:ascii="SimSun" w:hAnsi="SimSun" w:eastAsia="SimSun" w:cs="SimSun"/>
-          <w:sz w:val="24"/>
-          <w:szCs w:val="24"/>
-          <w:lang w:val="en-US"/>
-        </w:rPr>
-      </w:pPr>
-      <w:r>
-        <w:rPr>
-          <w:rFonts w:hint="default" w:ascii="SimSun" w:hAnsi="SimSun" w:eastAsia="SimSun" w:cs="SimSun"/>
-          <w:sz w:val="24"/>
-          <w:szCs w:val="24"/>
-          <w:lang w:val="en-US"/>
-        </w:rPr>
-        <w:t>Final Backend Arch:</w:t>
-      </w:r>
-    </w:p>
-    <w:p>
-      <w:pPr>
-        <w:rPr>
-          <w:rFonts w:hint="default" w:ascii="SimSun" w:hAnsi="SimSun" w:eastAsia="SimSun" w:cs="SimSun"/>
-          <w:sz w:val="24"/>
-          <w:szCs w:val="24"/>
-          <w:lang w:val="en-US"/>
-        </w:rPr>
-      </w:pPr>
-    </w:p>
-    <w:p>
-      <w:pPr>
-        <w:jc w:val="center"/>
-        <w:rPr>
-          <w:rFonts w:hint="default" w:ascii="SimSun" w:hAnsi="SimSun" w:eastAsia="SimSun" w:cs="SimSun"/>
-          <w:sz w:val="24"/>
-          <w:szCs w:val="24"/>
-          <w:lang w:val="en-US"/>
-        </w:rPr>
-      </w:pPr>
-      <w:r>
-        <w:rPr>
-          <w:rFonts w:hint="default" w:ascii="SimSun" w:hAnsi="SimSun" w:eastAsia="SimSun" w:cs="SimSun"/>
-          <w:sz w:val="24"/>
-          <w:szCs w:val="24"/>
-          <w:lang w:val="en-US"/>
-        </w:rPr>
-        <w:t>Next.js Frontend</w:t>
-      </w:r>
-    </w:p>
-    <w:p>
-      <w:pPr>
-        <w:jc w:val="center"/>
-        <w:rPr>
-          <w:rFonts w:hint="default" w:ascii="SimSun" w:hAnsi="SimSun" w:eastAsia="SimSun" w:cs="SimSun"/>
-          <w:sz w:val="24"/>
-          <w:szCs w:val="24"/>
-          <w:lang w:val="en-US"/>
-        </w:rPr>
-      </w:pPr>
-      <w:r>
-        <w:rPr>
-          <w:rFonts w:hint="default" w:ascii="SimSun" w:hAnsi="SimSun" w:eastAsia="SimSun" w:cs="SimSun"/>
-          <w:sz w:val="24"/>
-          <w:szCs w:val="24"/>
-          <w:lang w:val="en-US"/>
-        </w:rPr>
-        <w:t>│</w:t>
-      </w:r>
-    </w:p>
-    <w:p>
-      <w:pPr>
-        <w:jc w:val="center"/>
-        <w:rPr>
-          <w:rFonts w:hint="default" w:ascii="SimSun" w:hAnsi="SimSun" w:eastAsia="SimSun" w:cs="SimSun"/>
-          <w:sz w:val="24"/>
-          <w:szCs w:val="24"/>
-          <w:lang w:val="en-US"/>
-        </w:rPr>
-      </w:pPr>
-      <w:r>
-        <w:rPr>
-          <w:rFonts w:hint="default" w:ascii="SimSun" w:hAnsi="SimSun" w:eastAsia="SimSun" w:cs="SimSun"/>
-          <w:sz w:val="24"/>
-          <w:szCs w:val="24"/>
-          <w:lang w:val="en-US"/>
-        </w:rPr>
-        <w:t>HTTP Requests</w:t>
-      </w:r>
-    </w:p>
-    <w:p>
-      <w:pPr>
-        <w:jc w:val="center"/>
-        <w:rPr>
-          <w:rFonts w:hint="default" w:ascii="SimSun" w:hAnsi="SimSun" w:eastAsia="SimSun" w:cs="SimSun"/>
-          <w:sz w:val="24"/>
-          <w:szCs w:val="24"/>
-          <w:lang w:val="en-US"/>
-        </w:rPr>
-      </w:pPr>
-      <w:r>
-        <w:rPr>
-          <w:rFonts w:hint="default" w:ascii="SimSun" w:hAnsi="SimSun" w:eastAsia="SimSun" w:cs="SimSun"/>
-          <w:sz w:val="24"/>
-          <w:szCs w:val="24"/>
-          <w:lang w:val="en-US"/>
-        </w:rPr>
-        <w:t>│</w:t>
-      </w:r>
-    </w:p>
-    <w:p>
-      <w:pPr>
-        <w:jc w:val="center"/>
-        <w:rPr>
-          <w:rFonts w:hint="default" w:ascii="SimSun" w:hAnsi="SimSun" w:eastAsia="SimSun" w:cs="SimSun"/>
-          <w:sz w:val="24"/>
-          <w:szCs w:val="24"/>
-          <w:lang w:val="en-US"/>
-        </w:rPr>
-      </w:pPr>
-      <w:r>
-        <w:rPr>
-          <w:rFonts w:hint="default" w:ascii="SimSun" w:hAnsi="SimSun" w:eastAsia="SimSun" w:cs="SimSun"/>
-          <w:sz w:val="24"/>
-          <w:szCs w:val="24"/>
-          <w:lang w:val="en-US"/>
-        </w:rPr>
-        <w:t>FastAPI Routes</w:t>
-      </w:r>
-    </w:p>
-    <w:p>
-      <w:pPr>
-        <w:jc w:val="center"/>
-        <w:rPr>
-          <w:rFonts w:hint="default" w:ascii="SimSun" w:hAnsi="SimSun" w:eastAsia="SimSun" w:cs="SimSun"/>
-          <w:sz w:val="24"/>
-          <w:szCs w:val="24"/>
-          <w:lang w:val="en-US"/>
-        </w:rPr>
-      </w:pPr>
-      <w:r>
-        <w:rPr>
-          <w:rFonts w:hint="default" w:ascii="SimSun" w:hAnsi="SimSun" w:eastAsia="SimSun" w:cs="SimSun"/>
-          <w:sz w:val="24"/>
-          <w:szCs w:val="24"/>
-          <w:lang w:val="en-US"/>
-        </w:rPr>
-        <w:t>│</w:t>
-      </w:r>
-    </w:p>
-    <w:p>
-      <w:pPr>
-        <w:jc w:val="center"/>
-        <w:rPr>
-          <w:rFonts w:hint="default" w:ascii="SimSun" w:hAnsi="SimSun" w:eastAsia="SimSun" w:cs="SimSun"/>
-          <w:sz w:val="24"/>
-          <w:szCs w:val="24"/>
-          <w:lang w:val="en-US"/>
-        </w:rPr>
-      </w:pPr>
-      <w:r>
-        <w:rPr>
-          <w:rFonts w:hint="default" w:ascii="SimSun" w:hAnsi="SimSun" w:eastAsia="SimSun" w:cs="SimSun"/>
-          <w:sz w:val="24"/>
-          <w:szCs w:val="24"/>
-          <w:lang w:val="en-US"/>
-        </w:rPr>
-        <w:t>┌───────────────┼────────────────┐</w:t>
-      </w:r>
-    </w:p>
-    <w:p>
-      <w:pPr>
-        <w:jc w:val="center"/>
-        <w:rPr>
-          <w:rFonts w:hint="default" w:ascii="SimSun" w:hAnsi="SimSun" w:eastAsia="SimSun" w:cs="SimSun"/>
-          <w:sz w:val="24"/>
-          <w:szCs w:val="24"/>
-          <w:lang w:val="en-US"/>
-        </w:rPr>
-      </w:pPr>
-      <w:r>
-        <w:rPr>
-          <w:rFonts w:hint="default" w:ascii="SimSun" w:hAnsi="SimSun" w:eastAsia="SimSun" w:cs="SimSun"/>
-          <w:sz w:val="24"/>
-          <w:szCs w:val="24"/>
-          <w:lang w:val="en-US"/>
-        </w:rPr>
-        <w:t>▼               ▼               ▼</w:t>
-      </w:r>
-    </w:p>
-    <w:p>
-      <w:pPr>
-        <w:jc w:val="center"/>
-        <w:rPr>
-          <w:rFonts w:hint="default" w:ascii="SimSun" w:hAnsi="SimSun" w:eastAsia="SimSun" w:cs="SimSun"/>
-          <w:sz w:val="24"/>
-          <w:szCs w:val="24"/>
-          <w:lang w:val="en-US"/>
-        </w:rPr>
-      </w:pPr>
-      <w:r>
-        <w:rPr>
-          <w:rFonts w:hint="default" w:ascii="SimSun" w:hAnsi="SimSun" w:eastAsia="SimSun" w:cs="SimSun"/>
-          <w:sz w:val="24"/>
-          <w:szCs w:val="24"/>
-          <w:lang w:val="en-US"/>
-        </w:rPr>
-        <w:t>ForecastService  AttributionService  SimulationService</w:t>
-      </w:r>
-    </w:p>
-    <w:p>
-      <w:pPr>
-        <w:jc w:val="center"/>
-        <w:rPr>
-          <w:rFonts w:hint="default" w:ascii="SimSun" w:hAnsi="SimSun" w:eastAsia="SimSun" w:cs="SimSun"/>
-          <w:sz w:val="24"/>
-          <w:szCs w:val="24"/>
-          <w:lang w:val="en-US"/>
-        </w:rPr>
-      </w:pPr>
-      <w:r>
-        <w:rPr>
-          <w:rFonts w:hint="default" w:ascii="SimSun" w:hAnsi="SimSun" w:eastAsia="SimSun" w:cs="SimSun"/>
-          <w:sz w:val="24"/>
-          <w:szCs w:val="24"/>
-          <w:lang w:val="en-US"/>
-        </w:rPr>
-        <w:t>│               │               │</w:t>
-      </w:r>
-    </w:p>
-    <w:p>
-      <w:pPr>
-        <w:jc w:val="center"/>
-        <w:rPr>
-          <w:rFonts w:hint="default" w:ascii="SimSun" w:hAnsi="SimSun" w:eastAsia="SimSun" w:cs="SimSun"/>
-          <w:sz w:val="24"/>
-          <w:szCs w:val="24"/>
-          <w:lang w:val="en-US"/>
-        </w:rPr>
-      </w:pPr>
-      <w:r>
-        <w:rPr>
-          <w:rFonts w:hint="default" w:ascii="SimSun" w:hAnsi="SimSun" w:eastAsia="SimSun" w:cs="SimSun"/>
-          <w:sz w:val="24"/>
-          <w:szCs w:val="24"/>
-          <w:lang w:val="en-US"/>
-        </w:rPr>
-        <w:t>└───────────────┼───────────────┘</w:t>
-      </w:r>
-    </w:p>
-    <w:p>
-      <w:pPr>
-        <w:jc w:val="center"/>
-        <w:rPr>
-          <w:rFonts w:hint="default" w:ascii="SimSun" w:hAnsi="SimSun" w:eastAsia="SimSun" w:cs="SimSun"/>
-          <w:sz w:val="24"/>
-          <w:szCs w:val="24"/>
-          <w:lang w:val="en-US"/>
-        </w:rPr>
-      </w:pPr>
-      <w:r>
-        <w:rPr>
-          <w:rFonts w:hint="default" w:ascii="SimSun" w:hAnsi="SimSun" w:eastAsia="SimSun" w:cs="SimSun"/>
-          <w:sz w:val="24"/>
-          <w:szCs w:val="24"/>
-          <w:lang w:val="en-US"/>
-        </w:rPr>
-        <w:t>▼</w:t>
-      </w:r>
-    </w:p>
-    <w:p>
-      <w:pPr>
-        <w:jc w:val="center"/>
-        <w:rPr>
-          <w:rFonts w:hint="default" w:ascii="SimSun" w:hAnsi="SimSun" w:eastAsia="SimSun" w:cs="SimSun"/>
-          <w:sz w:val="24"/>
-          <w:szCs w:val="24"/>
-          <w:lang w:val="en-US"/>
-        </w:rPr>
-      </w:pPr>
-      <w:r>
-        <w:rPr>
-          <w:rFonts w:hint="default" w:ascii="SimSun" w:hAnsi="SimSun" w:eastAsia="SimSun" w:cs="SimSun"/>
-          <w:sz w:val="24"/>
-          <w:szCs w:val="24"/>
-          <w:lang w:val="en-US"/>
-        </w:rPr>
-        <w:t>AdvisoryService</w:t>
-      </w:r>
-    </w:p>
-    <w:p>
-      <w:pPr>
-        <w:jc w:val="center"/>
-        <w:rPr>
-          <w:rFonts w:hint="default" w:ascii="SimSun" w:hAnsi="SimSun" w:eastAsia="SimSun" w:cs="SimSun"/>
-          <w:sz w:val="24"/>
-          <w:szCs w:val="24"/>
-          <w:lang w:val="en-US"/>
-        </w:rPr>
-      </w:pPr>
-      <w:r>
-        <w:rPr>
-          <w:rFonts w:hint="default" w:ascii="SimSun" w:hAnsi="SimSun" w:eastAsia="SimSun" w:cs="SimSun"/>
-          <w:sz w:val="24"/>
-          <w:szCs w:val="24"/>
-          <w:lang w:val="en-US"/>
-        </w:rPr>
-        <w:t>│</w:t>
-      </w:r>
-    </w:p>
-    <w:p>
-      <w:pPr>
-        <w:jc w:val="center"/>
-        <w:rPr>
-          <w:rFonts w:hint="default" w:ascii="SimSun" w:hAnsi="SimSun" w:eastAsia="SimSun" w:cs="SimSun"/>
-          <w:sz w:val="24"/>
-          <w:szCs w:val="24"/>
-          <w:lang w:val="en-US"/>
-        </w:rPr>
-      </w:pPr>
-      <w:r>
-        <w:rPr>
-          <w:rFonts w:hint="default" w:ascii="SimSun" w:hAnsi="SimSun" w:eastAsia="SimSun" w:cs="SimSun"/>
-          <w:sz w:val="24"/>
-          <w:szCs w:val="24"/>
-          <w:lang w:val="en-US"/>
-        </w:rPr>
-        <w:t>▼</w:t>
-      </w:r>
-    </w:p>
-    <w:p>
-      <w:pPr>
-        <w:jc w:val="center"/>
-        <w:rPr>
-          <w:rFonts w:hint="default" w:ascii="SimSun" w:hAnsi="SimSun" w:eastAsia="SimSun" w:cs="SimSun"/>
-          <w:sz w:val="24"/>
-          <w:szCs w:val="24"/>
-          <w:lang w:val="en-US"/>
-        </w:rPr>
-      </w:pPr>
-      <w:r>
-        <w:rPr>
-          <w:rFonts w:hint="default" w:ascii="SimSun" w:hAnsi="SimSun" w:eastAsia="SimSun" w:cs="SimSun"/>
-          <w:sz w:val="24"/>
-          <w:szCs w:val="24"/>
-          <w:lang w:val="en-US"/>
-        </w:rPr>
-        <w:t>FeaturePreprocessor</w:t>
-      </w:r>
-    </w:p>
-    <w:p>
-      <w:pPr>
-        <w:jc w:val="center"/>
-        <w:rPr>
-          <w:rFonts w:hint="default" w:ascii="SimSun" w:hAnsi="SimSun" w:eastAsia="SimSun" w:cs="SimSun"/>
-          <w:sz w:val="24"/>
-          <w:szCs w:val="24"/>
-          <w:lang w:val="en-US"/>
-        </w:rPr>
-      </w:pPr>
-      <w:r>
-        <w:rPr>
-          <w:rFonts w:hint="default" w:ascii="SimSun" w:hAnsi="SimSun" w:eastAsia="SimSun" w:cs="SimSun"/>
-          <w:sz w:val="24"/>
-          <w:szCs w:val="24"/>
-          <w:lang w:val="en-US"/>
-        </w:rPr>
-        <w:t>│</w:t>
-      </w:r>
-    </w:p>
-    <w:p>
-      <w:pPr>
-        <w:jc w:val="center"/>
-        <w:rPr>
-          <w:rFonts w:hint="default" w:ascii="SimSun" w:hAnsi="SimSun" w:eastAsia="SimSun" w:cs="SimSun"/>
-          <w:sz w:val="24"/>
-          <w:szCs w:val="24"/>
-          <w:lang w:val="en-US"/>
-        </w:rPr>
-      </w:pPr>
-      <w:r>
-        <w:rPr>
-          <w:rFonts w:hint="default" w:ascii="SimSun" w:hAnsi="SimSun" w:eastAsia="SimSun" w:cs="SimSun"/>
-          <w:sz w:val="24"/>
-          <w:szCs w:val="24"/>
-          <w:lang w:val="en-US"/>
-        </w:rPr>
-        <w:t>▼</w:t>
-      </w:r>
-    </w:p>
-    <w:p>
-      <w:pPr>
-        <w:jc w:val="center"/>
-        <w:rPr>
-          <w:rFonts w:hint="default" w:ascii="SimSun" w:hAnsi="SimSun" w:eastAsia="SimSun" w:cs="SimSun"/>
-          <w:sz w:val="24"/>
-          <w:szCs w:val="24"/>
-          <w:lang w:val="en-US"/>
-        </w:rPr>
-      </w:pPr>
-      <w:r>
-        <w:rPr>
-          <w:rFonts w:hint="default" w:ascii="SimSun" w:hAnsi="SimSun" w:eastAsia="SimSun" w:cs="SimSun"/>
-          <w:sz w:val="24"/>
-          <w:szCs w:val="24"/>
-          <w:lang w:val="en-US"/>
-        </w:rPr>
-        <w:t>ModelLoader</w:t>
-      </w:r>
-    </w:p>
-    <w:p>
-      <w:pPr>
-        <w:jc w:val="center"/>
-        <w:rPr>
-          <w:rFonts w:hint="default" w:ascii="SimSun" w:hAnsi="SimSun" w:eastAsia="SimSun" w:cs="SimSun"/>
-          <w:sz w:val="24"/>
-          <w:szCs w:val="24"/>
-          <w:lang w:val="en-US"/>
-        </w:rPr>
-      </w:pPr>
-      <w:r>
-        <w:rPr>
-          <w:rFonts w:hint="default" w:ascii="SimSun" w:hAnsi="SimSun" w:eastAsia="SimSun" w:cs="SimSun"/>
-          <w:sz w:val="24"/>
-          <w:szCs w:val="24"/>
-          <w:lang w:val="en-US"/>
-        </w:rPr>
-        <w:t>┌───────────┴───────────┐</w:t>
-      </w:r>
-    </w:p>
-    <w:p>
-      <w:pPr>
-        <w:jc w:val="center"/>
-        <w:rPr>
-          <w:rFonts w:hint="default" w:ascii="SimSun" w:hAnsi="SimSun" w:eastAsia="SimSun" w:cs="SimSun"/>
-          <w:sz w:val="24"/>
-          <w:szCs w:val="24"/>
-          <w:lang w:val="en-US"/>
-        </w:rPr>
-      </w:pPr>
-      <w:r>
-        <w:rPr>
-          <w:rFonts w:hint="default" w:ascii="SimSun" w:hAnsi="SimSun" w:eastAsia="SimSun" w:cs="SimSun"/>
-          <w:sz w:val="24"/>
-          <w:szCs w:val="24"/>
-          <w:lang w:val="en-US"/>
-        </w:rPr>
-        <w:t>▼                       ▼</w:t>
-      </w:r>
-    </w:p>
-    <w:p>
-      <w:pPr>
-        <w:jc w:val="center"/>
-        <w:rPr>
-          <w:rFonts w:hint="default" w:ascii="SimSun" w:hAnsi="SimSun" w:eastAsia="SimSun" w:cs="SimSun"/>
-          <w:sz w:val="24"/>
-          <w:szCs w:val="24"/>
-          <w:lang w:val="en-US"/>
-        </w:rPr>
-      </w:pPr>
-      <w:r>
-        <w:rPr>
-          <w:rFonts w:hint="default" w:ascii="SimSun" w:hAnsi="SimSun" w:eastAsia="SimSun" w:cs="SimSun"/>
-          <w:sz w:val="24"/>
-          <w:szCs w:val="24"/>
-          <w:lang w:val="en-US"/>
-        </w:rPr>
-        <w:t>XGBoost Models          SHAP Artifacts</w:t>
-      </w:r>
     </w:p>
     <w:sectPr>
       <w:pgSz w:w="11906" w:h="16838"/>

</xml_diff>